<commit_message>
Update: Add new text styles for testing
User added new formatting styles to test the Word-based formatting system.
The system will now apply these styles to generated BAIL documents.

🤖 Generated with [Claude Code](https://claude.com/claude-code)

Co-Authored-By: Claude <noreply@anthropic.com>
</commit_message>
<xml_diff>
--- a/Textes BAIL avec styles.docx
+++ b/Textes BAIL avec styles.docx
@@ -328,7 +328,17 @@
       </w:r>
       <w:r>
         <w:br/>
-        <w:t>Ci-après dénommée : le « Bailleur »</w:t>
+        <w:t xml:space="preserve">Ci-après dénommée : le « </w:t>
+      </w:r>
+      <w:r>
+        <w:rPr>
+          <w:b/>
+          <w:bCs/>
+        </w:rPr>
+        <w:t>Bailleur</w:t>
+      </w:r>
+      <w:r>
+        <w:t xml:space="preserve"> »</w:t>
       </w:r>
     </w:p>
     <w:p>

</xml_diff>

<commit_message>
Update: Improve text styles in Word template
User updated text formatting styles in the Word document for better styling
in generated BAIL documents.

🤖 Generated with [Claude Code](https://claude.com/claude-code)

Co-Authored-By: Claude <noreply@anthropic.com>
</commit_message>
<xml_diff>
--- a/Textes BAIL avec styles.docx
+++ b/Textes BAIL avec styles.docx
@@ -130,28 +130,84 @@
     </w:p>
     <w:p>
       <w:r>
-        <w:t>La Société FORGEOT PROPERTY, société civile Immobilière au capital de 310.000 €, dont le siège social est à PARIS (75017), 267 boulevard Pereire, immatriculée au Registre du Commerce et des Sociétés de PARIS sous le numéro unique d'identification 804 088 094,</w:t>
-      </w:r>
-      <w:r>
-        <w:br/>
-      </w:r>
-      <w:r>
-        <w:br/>
-        <w:t xml:space="preserve">Représentée par son gérant, la Société F&amp;A ASSET MANAGEMENT, SAS dont le siège social est à Paris (75017) - 267, Boulevard Pereire, immatriculée au Registre du Commerce et des Sociétés de Paris sous le numéro B 824 057 087, </w:t>
-      </w:r>
-      <w:r>
-        <w:br/>
-      </w:r>
-      <w:r>
-        <w:br/>
-        <w:t>Elle-même représentée par son Président Monsieur Maxime FORGEOT, dument habilité à l'effet des présentes.</w:t>
-      </w:r>
-      <w:r>
-        <w:br/>
-      </w:r>
-      <w:r>
-        <w:br/>
-        <w:t>Ci-après dénommée : le « Bailleur »</w:t>
+        <w:t xml:space="preserve">La </w:t>
+      </w:r>
+      <w:r>
+        <w:rPr>
+          <w:b/>
+          <w:bCs/>
+        </w:rPr>
+        <w:t>Société FORGEOT PROPERTY</w:t>
+      </w:r>
+      <w:r>
+        <w:t>, société civile Immobilière au capital de 310.000 €, dont le siège social est à PARIS (75017), 267 boulevard Pereire, immatriculée au Registre du Commerce et des Sociétés de PARIS sous le numéro unique d'identification 804 088 094,</w:t>
+      </w:r>
+      <w:r>
+        <w:br/>
+      </w:r>
+      <w:r>
+        <w:br/>
+        <w:t xml:space="preserve">Représentée par son gérant, la </w:t>
+      </w:r>
+      <w:r>
+        <w:rPr>
+          <w:b/>
+          <w:bCs/>
+        </w:rPr>
+        <w:t>Société F&amp;A ASSET MANAGEMENT</w:t>
+      </w:r>
+      <w:r>
+        <w:t xml:space="preserve">, SAS dont le siège social est à Paris (75017) - 267, Boulevard Pereire, immatriculée au Registre du Commerce et des Sociétés de Paris sous le numéro B 824 057 087, </w:t>
+      </w:r>
+      <w:r>
+        <w:br/>
+      </w:r>
+      <w:r>
+        <w:br/>
+        <w:t xml:space="preserve">Elle-même représentée par son </w:t>
+      </w:r>
+      <w:proofErr w:type="spellStart"/>
+      <w:r>
+        <w:t>Président</w:t>
+      </w:r>
+      <w:proofErr w:type="spellEnd"/>
+      <w:r>
+        <w:t xml:space="preserve"> </w:t>
+      </w:r>
+      <w:r>
+        <w:rPr>
+          <w:b/>
+          <w:bCs/>
+        </w:rPr>
+        <w:t>Monsieur Maxime FORGEOT</w:t>
+      </w:r>
+      <w:r>
+        <w:t xml:space="preserve">, </w:t>
+      </w:r>
+      <w:proofErr w:type="spellStart"/>
+      <w:r>
+        <w:t>dument</w:t>
+      </w:r>
+      <w:proofErr w:type="spellEnd"/>
+      <w:r>
+        <w:t xml:space="preserve"> habilité à l'effet des présentes.</w:t>
+      </w:r>
+      <w:r>
+        <w:br/>
+      </w:r>
+      <w:r>
+        <w:br/>
+        <w:t xml:space="preserve">Ci-après dénommée : le « </w:t>
+      </w:r>
+      <w:r>
+        <w:rPr>
+          <w:b/>
+          <w:bCs/>
+        </w:rPr>
+        <w:t>Bailleur</w:t>
+      </w:r>
+      <w:r>
+        <w:t xml:space="preserve"> »</w:t>
       </w:r>
     </w:p>
     <w:p>
@@ -181,28 +237,68 @@
     </w:p>
     <w:p>
       <w:r>
-        <w:t>La Société FORGEOT RETAIL, société civile Immobilière au capital de 10.000 €, dont le siège social est à PARIS (75017), 267 boulevard Pereire, immatriculée au Registre du Commerce et des Sociétés de PARIS sous le numéro unique d'identification 804 048 445,</w:t>
-      </w:r>
-      <w:r>
-        <w:br/>
-      </w:r>
-      <w:r>
-        <w:br/>
-        <w:t xml:space="preserve">Représentée par son gérant, la Société F&amp;A ASSET MANAGEMENT, SAS dont le siège social est à Paris (75017) - 267, Boulevard Pereire, immatriculée au Registre du Commerce et des Sociétés de Paris sous le numéro B 824 057 087, </w:t>
-      </w:r>
-      <w:r>
-        <w:br/>
-      </w:r>
-      <w:r>
-        <w:br/>
-        <w:t>Elle-même représentée par son Président Monsieur Maxime FORGEOT, dument habilité à l'effet des présentes.</w:t>
-      </w:r>
-      <w:r>
-        <w:br/>
-      </w:r>
-      <w:r>
-        <w:br/>
-        <w:t>Ci-après dénommée : le « Bailleur »</w:t>
+        <w:t xml:space="preserve">La </w:t>
+      </w:r>
+      <w:r>
+        <w:rPr>
+          <w:b/>
+          <w:bCs/>
+        </w:rPr>
+        <w:t>Société FORGEOT RETAIL</w:t>
+      </w:r>
+      <w:r>
+        <w:t>, société civile Immobilière au capital de 10.000 €, dont le siège social est à PARIS (75017), 267 boulevard Pereire, immatriculée au Registre du Commerce et des Sociétés de PARIS sous le numéro unique d'identification 804 048 445,</w:t>
+      </w:r>
+      <w:r>
+        <w:br/>
+      </w:r>
+      <w:r>
+        <w:br/>
+        <w:t xml:space="preserve">Représentée par son gérant, la </w:t>
+      </w:r>
+      <w:r>
+        <w:rPr>
+          <w:b/>
+          <w:bCs/>
+        </w:rPr>
+        <w:t>Société F&amp;A ASSET MANAGEMENT</w:t>
+      </w:r>
+      <w:r>
+        <w:t xml:space="preserve">, SAS dont le siège social est à Paris (75017) - 267, Boulevard Pereire, immatriculée au Registre du Commerce et des Sociétés de Paris sous le numéro B 824 057 087, </w:t>
+      </w:r>
+      <w:r>
+        <w:br/>
+      </w:r>
+      <w:r>
+        <w:br/>
+        <w:t xml:space="preserve">Elle-même représentée par son Président </w:t>
+      </w:r>
+      <w:r>
+        <w:rPr>
+          <w:b/>
+          <w:bCs/>
+        </w:rPr>
+        <w:t>Monsieur Maxime FORGEOT</w:t>
+      </w:r>
+      <w:r>
+        <w:t>, dument habilité à l'effet des présentes.</w:t>
+      </w:r>
+      <w:r>
+        <w:br/>
+      </w:r>
+      <w:r>
+        <w:br/>
+        <w:t xml:space="preserve">Ci-après dénommée : le « </w:t>
+      </w:r>
+      <w:r>
+        <w:rPr>
+          <w:b/>
+          <w:bCs/>
+        </w:rPr>
+        <w:t>Bailleur</w:t>
+      </w:r>
+      <w:r>
+        <w:t xml:space="preserve"> »</w:t>
       </w:r>
     </w:p>
     <w:p>
@@ -232,7 +328,17 @@
     </w:p>
     <w:p>
       <w:r>
-        <w:t xml:space="preserve">La Société HIGH STREET RETAIL 1, société civile Immobilière au capital de 10.000 €, dont le siège social est à PARIS (75017), 267 boulevard Pereire, immatriculée au Registre du </w:t>
+        <w:t xml:space="preserve">La </w:t>
+      </w:r>
+      <w:r>
+        <w:rPr>
+          <w:b/>
+          <w:bCs/>
+        </w:rPr>
+        <w:t>Société HIGH STREET RETAIL 1</w:t>
+      </w:r>
+      <w:r>
+        <w:t xml:space="preserve">, société civile Immobilière au capital de 10.000 €, dont le siège social est à PARIS (75017), 267 boulevard Pereire, immatriculée au Registre du </w:t>
       </w:r>
       <w:r>
         <w:lastRenderedPageBreak/>
@@ -243,21 +349,51 @@
       </w:r>
       <w:r>
         <w:br/>
-        <w:t xml:space="preserve">Représentée par son gérant, la Société F&amp;A ASSET MANAGEMENT, SAS dont le siège social est à Paris (75017) - 267, Boulevard Pereire, immatriculée au Registre du Commerce et des Sociétés de Paris sous le numéro B 824 057 087, </w:t>
-      </w:r>
-      <w:r>
-        <w:br/>
-      </w:r>
-      <w:r>
-        <w:br/>
-        <w:t>Elle-même représentée par son Président Monsieur Maxime FORGEOT, dument habilité à l'effet des présentes.</w:t>
-      </w:r>
-      <w:r>
-        <w:br/>
-      </w:r>
-      <w:r>
-        <w:br/>
-        <w:t>Ci-après dénommée : le « Bailleur »</w:t>
+        <w:t xml:space="preserve">Représentée par son gérant, la </w:t>
+      </w:r>
+      <w:r>
+        <w:rPr>
+          <w:b/>
+          <w:bCs/>
+        </w:rPr>
+        <w:t>Société F&amp;A ASSET MANAGEMENT</w:t>
+      </w:r>
+      <w:r>
+        <w:t xml:space="preserve">, SAS dont le siège social est à Paris (75017) - 267, Boulevard Pereire, immatriculée au Registre du Commerce et des Sociétés de Paris sous le numéro B 824 057 087, </w:t>
+      </w:r>
+      <w:r>
+        <w:br/>
+      </w:r>
+      <w:r>
+        <w:br/>
+        <w:t xml:space="preserve">Elle-même représentée par son Président </w:t>
+      </w:r>
+      <w:r>
+        <w:rPr>
+          <w:b/>
+          <w:bCs/>
+        </w:rPr>
+        <w:t>Monsieur Maxime FORGEOT</w:t>
+      </w:r>
+      <w:r>
+        <w:t>, dument habilité à l'effet des présentes.</w:t>
+      </w:r>
+      <w:r>
+        <w:br/>
+      </w:r>
+      <w:r>
+        <w:br/>
+        <w:t xml:space="preserve">Ci-après dénommée : le « </w:t>
+      </w:r>
+      <w:r>
+        <w:rPr>
+          <w:b/>
+          <w:bCs/>
+        </w:rPr>
+        <w:t>Bailleur</w:t>
+      </w:r>
+      <w:r>
+        <w:t xml:space="preserve"> »</w:t>
       </w:r>
     </w:p>
     <w:p>
@@ -304,7 +440,25 @@
       </w:r>
       <w:r>
         <w:br/>
-        <w:t xml:space="preserve">Représentée par son gérant, la Société F&amp;A ASSET MANAGEMENT, SAS dont le siège social est à Paris (75017) - 267, Boulevard Pereire, immatriculée au Registre du Commerce et des Sociétés de Paris sous le numéro B 824 057 087, </w:t>
+        <w:t xml:space="preserve">Représentée par son </w:t>
+      </w:r>
+      <w:proofErr w:type="spellStart"/>
+      <w:r>
+        <w:t>gérant</w:t>
+      </w:r>
+      <w:proofErr w:type="spellEnd"/>
+      <w:r>
+        <w:t xml:space="preserve">, la </w:t>
+      </w:r>
+      <w:r>
+        <w:rPr>
+          <w:b/>
+          <w:bCs/>
+        </w:rPr>
+        <w:t>Société F&amp;A ASSET MANAGEMENT</w:t>
+      </w:r>
+      <w:r>
+        <w:t xml:space="preserve">, SAS dont le siège social est à Paris (75017) - 267, Boulevard Pereire, immatriculée au Registre du Commerce et des Sociétés de Paris sous le numéro B 824 057 087, </w:t>
       </w:r>
       <w:r>
         <w:br/>
@@ -368,14 +522,34 @@
     </w:p>
     <w:p>
       <w:r>
-        <w:t>La Société HIGH STREET RETAIL 3, société à responsabilité limitée au capital de 1.000 €, dont le siège social est à PARIS (75017), 267 boulevard Pereire, immatriculée au Registre du Commerce et des Sociétés de PARIS sous le numéro unique d'identification 810 334 102,</w:t>
-      </w:r>
-      <w:r>
-        <w:br/>
-      </w:r>
-      <w:r>
-        <w:br/>
-        <w:t xml:space="preserve">Représentée par son gérant, la Société F&amp;A ASSET MANAGEMENT, SAS dont le siège social est à Paris (75017) - 267, Boulevard Pereire, immatriculée au Registre du Commerce et des Sociétés de Paris sous le numéro  B 824 057 087, </w:t>
+        <w:t xml:space="preserve">La </w:t>
+      </w:r>
+      <w:r>
+        <w:rPr>
+          <w:b/>
+          <w:bCs/>
+        </w:rPr>
+        <w:t>Société HIGH STREET RETAIL 3</w:t>
+      </w:r>
+      <w:r>
+        <w:t>, société à responsabilité limitée au capital de 1.000 €, dont le siège social est à PARIS (75017), 267 boulevard Pereire, immatriculée au Registre du Commerce et des Sociétés de PARIS sous le numéro unique d'identification 810 334 102,</w:t>
+      </w:r>
+      <w:r>
+        <w:br/>
+      </w:r>
+      <w:r>
+        <w:br/>
+        <w:t xml:space="preserve">Représentée par son gérant, la </w:t>
+      </w:r>
+      <w:r>
+        <w:rPr>
+          <w:b/>
+          <w:bCs/>
+        </w:rPr>
+        <w:t>Société F&amp;A ASSET MANAGEMENT</w:t>
+      </w:r>
+      <w:r>
+        <w:t xml:space="preserve">, SAS dont le siège social est à Paris (75017) - 267, Boulevard Pereire, immatriculée au Registre du Commerce et des Sociétés de Paris sous le numéro  B 824 057 087, </w:t>
       </w:r>
       <w:r>
         <w:br/>
@@ -385,14 +559,34 @@
       </w:r>
       <w:r>
         <w:lastRenderedPageBreak/>
-        <w:t>Elle-même représentée par son Président Monsieur Maxime FORGEOT, dument habilité à l'effet des présentes.</w:t>
-      </w:r>
-      <w:r>
-        <w:br/>
-      </w:r>
-      <w:r>
-        <w:br/>
-        <w:t>Ci-après dénommée : le « Bailleur »</w:t>
+        <w:t xml:space="preserve">Elle-même représentée par son Président </w:t>
+      </w:r>
+      <w:r>
+        <w:rPr>
+          <w:b/>
+          <w:bCs/>
+        </w:rPr>
+        <w:t>Monsieur Maxime FORGEOT</w:t>
+      </w:r>
+      <w:r>
+        <w:t>, dument habilité à l'effet des présentes.</w:t>
+      </w:r>
+      <w:r>
+        <w:br/>
+      </w:r>
+      <w:r>
+        <w:br/>
+        <w:t xml:space="preserve">Ci-après dénommée : le « </w:t>
+      </w:r>
+      <w:r>
+        <w:rPr>
+          <w:b/>
+          <w:bCs/>
+        </w:rPr>
+        <w:t>Bailleur</w:t>
+      </w:r>
+      <w:r>
+        <w:t xml:space="preserve"> »</w:t>
       </w:r>
     </w:p>
     <w:p>
@@ -422,28 +616,68 @@
     </w:p>
     <w:p>
       <w:r>
-        <w:t>La Société HIGH STREET RETAIL 4, société par actions simplifiée au capital de 72.000 €, dont le siège social est à PARIS (75017), 267 boulevard Pereire, immatriculée au Registre du Commerce et des Sociétés de PARIS sous le numéro unique d'identification 390 174 589,</w:t>
-      </w:r>
-      <w:r>
-        <w:br/>
-      </w:r>
-      <w:r>
-        <w:br/>
-        <w:t xml:space="preserve">Représentée par son gérant, la Société F&amp;A ASSET MANAGEMENT, SAS dont le siège social est à Paris (75017) - 267, Boulevard Pereire, immatriculée au Registre du Commerce et des Sociétés de Paris sous le numéro B 824 057 087, </w:t>
-      </w:r>
-      <w:r>
-        <w:br/>
-      </w:r>
-      <w:r>
-        <w:br/>
-        <w:t>Elle-même représentée par son Président Monsieur Maxime FORGEOT, dument habilité à l'effet des présentes.</w:t>
-      </w:r>
-      <w:r>
-        <w:br/>
-      </w:r>
-      <w:r>
-        <w:br/>
-        <w:t>Ci-après dénommée : le « Bailleur »</w:t>
+        <w:t xml:space="preserve">La </w:t>
+      </w:r>
+      <w:r>
+        <w:rPr>
+          <w:b/>
+          <w:bCs/>
+        </w:rPr>
+        <w:t>Société HIGH STREET RETAIL 4</w:t>
+      </w:r>
+      <w:r>
+        <w:t>, société par actions simplifiée au capital de 72.000 €, dont le siège social est à PARIS (75017), 267 boulevard Pereire, immatriculée au Registre du Commerce et des Sociétés de PARIS sous le numéro unique d'identification 390 174 589,</w:t>
+      </w:r>
+      <w:r>
+        <w:br/>
+      </w:r>
+      <w:r>
+        <w:br/>
+        <w:t xml:space="preserve">Représentée par son gérant, la </w:t>
+      </w:r>
+      <w:r>
+        <w:rPr>
+          <w:b/>
+          <w:bCs/>
+        </w:rPr>
+        <w:t>Société F&amp;A ASSET MANAGEMENT</w:t>
+      </w:r>
+      <w:r>
+        <w:t xml:space="preserve">, SAS dont le siège social est à Paris (75017) - 267, Boulevard Pereire, immatriculée au Registre du Commerce et des Sociétés de Paris sous le numéro B 824 057 087, </w:t>
+      </w:r>
+      <w:r>
+        <w:br/>
+      </w:r>
+      <w:r>
+        <w:br/>
+        <w:t xml:space="preserve">Elle-même représentée par son Président </w:t>
+      </w:r>
+      <w:r>
+        <w:rPr>
+          <w:b/>
+          <w:bCs/>
+        </w:rPr>
+        <w:t>Monsieur Maxime FORGEOT</w:t>
+      </w:r>
+      <w:r>
+        <w:t>, dument habilité à l'effet des présentes.</w:t>
+      </w:r>
+      <w:r>
+        <w:br/>
+      </w:r>
+      <w:r>
+        <w:br/>
+        <w:t xml:space="preserve">Ci-après dénommée : le « </w:t>
+      </w:r>
+      <w:r>
+        <w:rPr>
+          <w:b/>
+          <w:bCs/>
+        </w:rPr>
+        <w:t>Bailleur</w:t>
+      </w:r>
+      <w:r>
+        <w:t xml:space="preserve"> »</w:t>
       </w:r>
     </w:p>
     <w:p>
@@ -473,28 +707,68 @@
     </w:p>
     <w:p>
       <w:r>
-        <w:t>La Société HIGH STREET RETAIL 5, société civile Immobilière au capital de 10.000 €, dont le siège social est à PARIS (75017), 267 boulevard Pereire, immatriculée au Registre du Commerce et des Sociétés de PARIS sous le numéro unique d'identification 850 407 149,</w:t>
-      </w:r>
-      <w:r>
-        <w:br/>
-      </w:r>
-      <w:r>
-        <w:br/>
-        <w:t xml:space="preserve">Représentée par son gérant, la Société F&amp;A ASSET MANAGEMENT, SAS dont le siège social est à Paris (75017) - 267, Boulevard Pereire, immatriculée au Registre du Commerce et des Sociétés de Paris sous le numéro B 824 057 087, </w:t>
-      </w:r>
-      <w:r>
-        <w:br/>
-      </w:r>
-      <w:r>
-        <w:br/>
-        <w:t>Elle-même représentée par son Président Monsieur Maxime FORGEOT, dument habilité à l'effet des présentes.</w:t>
-      </w:r>
-      <w:r>
-        <w:br/>
-      </w:r>
-      <w:r>
-        <w:br/>
-        <w:t>Ci-après dénommée : le « Bailleur »</w:t>
+        <w:t xml:space="preserve">La </w:t>
+      </w:r>
+      <w:r>
+        <w:rPr>
+          <w:b/>
+          <w:bCs/>
+        </w:rPr>
+        <w:t>Société HIGH STREET RETAIL 5</w:t>
+      </w:r>
+      <w:r>
+        <w:t>, société civile Immobilière au capital de 10.000 €, dont le siège social est à PARIS (75017), 267 boulevard Pereire, immatriculée au Registre du Commerce et des Sociétés de PARIS sous le numéro unique d'identification 850 407 149,</w:t>
+      </w:r>
+      <w:r>
+        <w:br/>
+      </w:r>
+      <w:r>
+        <w:br/>
+        <w:t xml:space="preserve">Représentée par son gérant, la </w:t>
+      </w:r>
+      <w:r>
+        <w:rPr>
+          <w:b/>
+          <w:bCs/>
+        </w:rPr>
+        <w:t>Société F&amp;A ASSET MANAGEMENT</w:t>
+      </w:r>
+      <w:r>
+        <w:t xml:space="preserve">, SAS dont le siège social est à Paris (75017) - 267, Boulevard Pereire, immatriculée au Registre du Commerce et des Sociétés de Paris sous le numéro B 824 057 087, </w:t>
+      </w:r>
+      <w:r>
+        <w:br/>
+      </w:r>
+      <w:r>
+        <w:br/>
+        <w:t xml:space="preserve">Elle-même représentée par son Président </w:t>
+      </w:r>
+      <w:r>
+        <w:rPr>
+          <w:b/>
+          <w:bCs/>
+        </w:rPr>
+        <w:t>Monsieur Maxime FORGEOT</w:t>
+      </w:r>
+      <w:r>
+        <w:t>, dument habilité à l'effet des présentes.</w:t>
+      </w:r>
+      <w:r>
+        <w:br/>
+      </w:r>
+      <w:r>
+        <w:br/>
+        <w:t xml:space="preserve">Ci-après dénommée : le « </w:t>
+      </w:r>
+      <w:r>
+        <w:rPr>
+          <w:b/>
+          <w:bCs/>
+        </w:rPr>
+        <w:t>Bailleur</w:t>
+      </w:r>
+      <w:r>
+        <w:t xml:space="preserve"> »</w:t>
       </w:r>
     </w:p>
     <w:p>
@@ -525,28 +799,68 @@
     </w:p>
     <w:p>
       <w:r>
-        <w:t>La Société HIGH STREET RETAIL 6, société civile Immobilière au capital de 10.000 €, dont le siège social est à PARIS (75017), 267 boulevard Pereire, immatriculée au Registre du Commerce et des Sociétés de PARIS sous le numéro unique d'identification 914 859 434,</w:t>
-      </w:r>
-      <w:r>
-        <w:br/>
-      </w:r>
-      <w:r>
-        <w:br/>
-        <w:t xml:space="preserve">Représentée par son gérant, la Société F&amp;A ASSET MANAGEMENT, SAS dont le siège social est à Paris (75017) - 267, Boulevard Pereire, immatriculée au Registre du Commerce et des Sociétés de Paris sous le numéro B 824 057 087, </w:t>
-      </w:r>
-      <w:r>
-        <w:br/>
-      </w:r>
-      <w:r>
-        <w:br/>
-        <w:t>Elle-même représentée par son Président Monsieur Maxime FORGEOT, dument habilité à l'effet des présentes.</w:t>
-      </w:r>
-      <w:r>
-        <w:br/>
-      </w:r>
-      <w:r>
-        <w:br/>
-        <w:t>Ci-après dénommée : le « Bailleur »</w:t>
+        <w:t xml:space="preserve">La </w:t>
+      </w:r>
+      <w:r>
+        <w:rPr>
+          <w:b/>
+          <w:bCs/>
+        </w:rPr>
+        <w:t>Société HIGH STREET RETAIL 6</w:t>
+      </w:r>
+      <w:r>
+        <w:t>, société civile Immobilière au capital de 10.000 €, dont le siège social est à PARIS (75017), 267 boulevard Pereire, immatriculée au Registre du Commerce et des Sociétés de PARIS sous le numéro unique d'identification 914 859 434,</w:t>
+      </w:r>
+      <w:r>
+        <w:br/>
+      </w:r>
+      <w:r>
+        <w:br/>
+        <w:t xml:space="preserve">Représentée par son gérant, la </w:t>
+      </w:r>
+      <w:r>
+        <w:rPr>
+          <w:b/>
+          <w:bCs/>
+        </w:rPr>
+        <w:t>Société F&amp;A ASSET MANAGEMENT</w:t>
+      </w:r>
+      <w:r>
+        <w:t xml:space="preserve">, SAS dont le siège social est à Paris (75017) - 267, Boulevard Pereire, immatriculée au Registre du Commerce et des Sociétés de Paris sous le numéro B 824 057 087, </w:t>
+      </w:r>
+      <w:r>
+        <w:br/>
+      </w:r>
+      <w:r>
+        <w:br/>
+        <w:t xml:space="preserve">Elle-même représentée par son Président </w:t>
+      </w:r>
+      <w:r>
+        <w:rPr>
+          <w:b/>
+          <w:bCs/>
+        </w:rPr>
+        <w:t>Monsieur Maxime FORGEOT</w:t>
+      </w:r>
+      <w:r>
+        <w:t>, dument habilité à l'effet des présentes.</w:t>
+      </w:r>
+      <w:r>
+        <w:br/>
+      </w:r>
+      <w:r>
+        <w:br/>
+        <w:t xml:space="preserve">Ci-après dénommée : le « </w:t>
+      </w:r>
+      <w:r>
+        <w:rPr>
+          <w:b/>
+          <w:bCs/>
+        </w:rPr>
+        <w:t>Bailleur</w:t>
+      </w:r>
+      <w:r>
+        <w:t xml:space="preserve"> »</w:t>
       </w:r>
     </w:p>
     <w:p>
@@ -576,28 +890,68 @@
     </w:p>
     <w:p>
       <w:r>
-        <w:t>La Société HRETAIL RENNES 1, société civile Immobilière au capital de 11.098 €, dont le siège social est à PARIS (75017), 267 boulevard Pereire, immatriculée au Registre du Commerce et des Sociétés de PARIS sous le numéro unique d'identification 801 971 508,</w:t>
-      </w:r>
-      <w:r>
-        <w:br/>
-      </w:r>
-      <w:r>
-        <w:br/>
-        <w:t xml:space="preserve">Représentée par son gérant, la Société F&amp;A ASSET MANAGEMENT, SAS dont le siège social est à Paris (75017) - 267, Boulevard Pereire, immatriculée au Registre du Commerce et des Sociétés de Paris sous le numéro B 824 057 087, </w:t>
-      </w:r>
-      <w:r>
-        <w:br/>
-      </w:r>
-      <w:r>
-        <w:br/>
-        <w:t>Elle-même représentée par son Président Monsieur Maxime FORGEOT, dument habilité à l'effet des présentes.</w:t>
-      </w:r>
-      <w:r>
-        <w:br/>
-      </w:r>
-      <w:r>
-        <w:br/>
-        <w:t>Ci-après dénommée : le « Bailleur »</w:t>
+        <w:t xml:space="preserve">La </w:t>
+      </w:r>
+      <w:r>
+        <w:rPr>
+          <w:b/>
+          <w:bCs/>
+        </w:rPr>
+        <w:t>Société HRETAIL RENNES 1</w:t>
+      </w:r>
+      <w:r>
+        <w:t>, société civile Immobilière au capital de 11.098 €, dont le siège social est à PARIS (75017), 267 boulevard Pereire, immatriculée au Registre du Commerce et des Sociétés de PARIS sous le numéro unique d'identification 801 971 508,</w:t>
+      </w:r>
+      <w:r>
+        <w:br/>
+      </w:r>
+      <w:r>
+        <w:br/>
+        <w:t xml:space="preserve">Représentée par son gérant, la </w:t>
+      </w:r>
+      <w:r>
+        <w:rPr>
+          <w:b/>
+          <w:bCs/>
+        </w:rPr>
+        <w:t>Société F&amp;A ASSET MANAGEMENT</w:t>
+      </w:r>
+      <w:r>
+        <w:t xml:space="preserve">, SAS dont le siège social est à Paris (75017) - 267, Boulevard Pereire, immatriculée au Registre du Commerce et des Sociétés de Paris sous le numéro B 824 057 087, </w:t>
+      </w:r>
+      <w:r>
+        <w:br/>
+      </w:r>
+      <w:r>
+        <w:br/>
+        <w:t xml:space="preserve">Elle-même représentée par son Président </w:t>
+      </w:r>
+      <w:r>
+        <w:rPr>
+          <w:b/>
+          <w:bCs/>
+        </w:rPr>
+        <w:t>Monsieur Maxime FORGEOT</w:t>
+      </w:r>
+      <w:r>
+        <w:t>, dument habilité à l'effet des présentes.</w:t>
+      </w:r>
+      <w:r>
+        <w:br/>
+      </w:r>
+      <w:r>
+        <w:br/>
+        <w:t xml:space="preserve">Ci-après dénommée : le « </w:t>
+      </w:r>
+      <w:r>
+        <w:rPr>
+          <w:b/>
+          <w:bCs/>
+        </w:rPr>
+        <w:t>Bailleur</w:t>
+      </w:r>
+      <w:r>
+        <w:t xml:space="preserve"> »</w:t>
       </w:r>
     </w:p>
     <w:p>
@@ -627,7 +981,17 @@
     </w:p>
     <w:p>
       <w:r>
-        <w:t>La Société RETAIL RENNES 2, société civile Immobilière au capital de 39.748 €, dont le siège social est à PARIS (75017), 267 boulevard Pereire, immatriculée au Registre du Commerce et des Sociétés de PARIS sous le numéro unique d'identification 801 932 617,</w:t>
+        <w:t xml:space="preserve">La </w:t>
+      </w:r>
+      <w:r>
+        <w:rPr>
+          <w:b/>
+          <w:bCs/>
+        </w:rPr>
+        <w:t>Société RETAIL RENNES</w:t>
+      </w:r>
+      <w:r>
+        <w:t xml:space="preserve"> 2, société civile Immobilière au capital de 39.748 €, dont le siège social est à PARIS (75017), 267 boulevard Pereire, immatriculée au Registre du Commerce et des Sociétés de PARIS sous le numéro unique d'identification 801 932 617,</w:t>
       </w:r>
       <w:r>
         <w:br/>
@@ -635,21 +999,51 @@
       <w:r>
         <w:lastRenderedPageBreak/>
         <w:br/>
-        <w:t xml:space="preserve">Représentée par son gérant, la Société F&amp;A ASSET MANAGEMENT, SAS dont le siège social est à Paris (75017) - 267, Boulevard Pereire, immatriculée au Registre du Commerce et des Sociétés de Paris sous le numéro B 824 057 087, </w:t>
-      </w:r>
-      <w:r>
-        <w:br/>
-      </w:r>
-      <w:r>
-        <w:br/>
-        <w:t>Elle-même représentée par son Président Monsieur Maxime FORGEOT, dument habilité à l'effet des présentes.</w:t>
-      </w:r>
-      <w:r>
-        <w:br/>
-      </w:r>
-      <w:r>
-        <w:br/>
-        <w:t>Ci-après dénommée : le « Bailleur »</w:t>
+        <w:t xml:space="preserve">Représentée par son gérant, la </w:t>
+      </w:r>
+      <w:r>
+        <w:rPr>
+          <w:b/>
+          <w:bCs/>
+        </w:rPr>
+        <w:t>Société F&amp;A ASSET MANAGEMENT</w:t>
+      </w:r>
+      <w:r>
+        <w:t xml:space="preserve">, SAS dont le siège social est à Paris (75017) - 267, Boulevard Pereire, immatriculée au Registre du Commerce et des Sociétés de Paris sous le numéro B 824 057 087, </w:t>
+      </w:r>
+      <w:r>
+        <w:br/>
+      </w:r>
+      <w:r>
+        <w:br/>
+        <w:t xml:space="preserve">Elle-même représentée par son Président </w:t>
+      </w:r>
+      <w:r>
+        <w:rPr>
+          <w:b/>
+          <w:bCs/>
+        </w:rPr>
+        <w:t>Monsieur Maxime FORGEOT</w:t>
+      </w:r>
+      <w:r>
+        <w:t>, dument habilité à l'effet des présentes.</w:t>
+      </w:r>
+      <w:r>
+        <w:br/>
+      </w:r>
+      <w:r>
+        <w:br/>
+        <w:t xml:space="preserve">Ci-après dénommée : le « </w:t>
+      </w:r>
+      <w:r>
+        <w:rPr>
+          <w:b/>
+          <w:bCs/>
+        </w:rPr>
+        <w:t>Bailleur</w:t>
+      </w:r>
+      <w:r>
+        <w:t xml:space="preserve"> »</w:t>
       </w:r>
     </w:p>
     <w:p>
@@ -679,7 +1073,14 @@
     </w:p>
     <w:p>
       <w:r>
-        <w:t>Monsieur/Madame [Nom Preneur], né le [.] à [.], [profession], demeurant [.], marié avec Madame |PRÉNOMS + NOM de JEUNE FILLE] née le [.] à [.] sous le régime de la séparation de biens suivant contrat de mariage reçu par Me [NOM DU NOTAIRE] à [.] ayant précédé leur union célébrée le [DATE DU MARIAGE] en la Commune de [.].</w:t>
+        <w:rPr>
+          <w:b/>
+          <w:bCs/>
+        </w:rPr>
+        <w:t>Monsieur/Madame [Nom Preneur]</w:t>
+      </w:r>
+      <w:r>
+        <w:t>, né le [.] à [.], [profession], demeurant [.], marié avec Madame |PRÉNOMS + NOM de JEUNE FILLE] née le [.] à [.] sous le régime de la séparation de biens suivant contrat de mariage reçu par Me [NOM DU NOTAIRE] à [.] ayant précédé leur union célébrée le [DATE DU MARIAGE] en la Commune de [.].</w:t>
       </w:r>
       <w:r>
         <w:br/>
@@ -770,7 +1171,27 @@
     </w:p>
     <w:p>
       <w:r>
-        <w:t>La société [NOM DE LA SOCIETE], Société [TYPE DE SOCIETE] au capital de [CAPITAL SOCIAL], immatriculée au Registre du Commerce et des Sociétés de [LOCALITE RCS] sous le numéro [N° DE SIRET], dont le siège social est à [ADRESSE DE DOMICILIATION], représentée par Madame/Monsieur [PRESIDENT DE LA SOCIETE], dûment habilité aux fins des présentes en vertu [.], ci-après annexé</w:t>
+        <w:t xml:space="preserve">La </w:t>
+      </w:r>
+      <w:r>
+        <w:rPr>
+          <w:b/>
+          <w:bCs/>
+        </w:rPr>
+        <w:t>société [NOM DE LA SOCIETE]</w:t>
+      </w:r>
+      <w:r>
+        <w:t xml:space="preserve">, Société [TYPE DE SOCIETE] au capital de [CAPITAL SOCIAL], immatriculée au Registre du Commerce et des Sociétés de [LOCALITE RCS] sous le numéro [N° DE SIRET], dont le siège social est à [ADRESSE DE DOMICILIATION], représentée par Madame/Monsieur </w:t>
+      </w:r>
+      <w:r>
+        <w:rPr>
+          <w:b/>
+          <w:bCs/>
+        </w:rPr>
+        <w:t>[PRESIDENT DE LA SOCIETE]</w:t>
+      </w:r>
+      <w:r>
+        <w:t>, dûment habilité aux fins des présentes en vertu [.], ci-après annexé</w:t>
       </w:r>
     </w:p>
     <w:p>
@@ -800,7 +1221,27 @@
     </w:p>
     <w:p>
       <w:r>
-        <w:t>La société [NOM DE LA SOCIETE], Société [TYPE DE SOCIETE] au capital de [CAPITAL SOCIAL], immatriculée au Registre du Commerce et des Sociétés de [LOCALITE RCS] sous le numéro [N° DE SIRET], dont le siège social est à [ADRESSE DE DOMICILIATION], représentée par Madame/Monsieur [PRESIDENT DE LA SOCIETE], dûment habilité aux fins des présentes en vertu [.], ci-après annexé</w:t>
+        <w:t xml:space="preserve">La </w:t>
+      </w:r>
+      <w:r>
+        <w:rPr>
+          <w:b/>
+          <w:bCs/>
+        </w:rPr>
+        <w:t>société [NOM DE LA SOCIETE]</w:t>
+      </w:r>
+      <w:r>
+        <w:t xml:space="preserve">, Société [TYPE DE SOCIETE] au capital de [CAPITAL SOCIAL], immatriculée au Registre du Commerce et des Sociétés de [LOCALITE RCS] sous le numéro [N° DE SIRET], dont le siège social est à [ADRESSE DE DOMICILIATION], représentée par Madame/Monsieur </w:t>
+      </w:r>
+      <w:r>
+        <w:rPr>
+          <w:b/>
+          <w:bCs/>
+        </w:rPr>
+        <w:t>[PRESIDENT DE LA SOCIETE]</w:t>
+      </w:r>
+      <w:r>
+        <w:t>, dûment habilité aux fins des présentes en vertu [.], ci-après annexé</w:t>
       </w:r>
     </w:p>
     <w:p>
@@ -834,7 +1275,27 @@
       </w:r>
       <w:r>
         <w:br/>
-        <w:t xml:space="preserve">La société XXXX, société [.] au capital de [.], en cours d’immatriculation auprès du Registre du Commerce et des Sociétés de [.], dont le siège social est à [.], représentée par Madame/Monsieur [.], dûment habilité aux fins des présentes en vertu, </w:t>
+        <w:t xml:space="preserve">La </w:t>
+      </w:r>
+      <w:r>
+        <w:rPr>
+          <w:b/>
+          <w:bCs/>
+        </w:rPr>
+        <w:t>société XXXX</w:t>
+      </w:r>
+      <w:r>
+        <w:t xml:space="preserve">, société [.] au capital de [.], en cours d’immatriculation auprès du Registre du Commerce et des Sociétés de [.], dont le siège social est à [.], représentée par Madame/Monsieur </w:t>
+      </w:r>
+      <w:r>
+        <w:rPr>
+          <w:b/>
+          <w:bCs/>
+        </w:rPr>
+        <w:t>[.]</w:t>
+      </w:r>
+      <w:r>
+        <w:t xml:space="preserve">, dûment habilité aux fins des présentes en vertu, </w:t>
       </w:r>
       <w:r>
         <w:br/>
@@ -977,25 +1438,102 @@
     </w:p>
     <w:p>
       <w:r>
-        <w:t>ARTICLE PRELIMINAIRE : BAIL SOUS CONDITION SUSPENSIVE</w:t>
-      </w:r>
-      <w:r>
-        <w:br/>
-      </w:r>
-      <w:r>
-        <w:br/>
-      </w:r>
-      <w:r>
-        <w:br/>
-        <w:t>1.      Condition suspensive et délais</w:t>
-      </w:r>
-      <w:r>
-        <w:br/>
-      </w:r>
-      <w:r>
-        <w:br/>
-        <w:t>Le présent Bail est consenti et accepté par le Bailleur et le Preneur sous réserve de la réalisation de la condition suspensive suivante :</w:t>
-      </w:r>
+        <w:rPr>
+          <w:b/>
+          <w:bCs/>
+          <w:u w:val="single"/>
+        </w:rPr>
+        <w:t xml:space="preserve">ARTICLE </w:t>
+      </w:r>
+      <w:proofErr w:type="gramStart"/>
+      <w:r>
+        <w:rPr>
+          <w:b/>
+          <w:bCs/>
+          <w:u w:val="single"/>
+        </w:rPr>
+        <w:t>PRELIMINAIRE :</w:t>
+      </w:r>
+      <w:proofErr w:type="gramEnd"/>
+      <w:r>
+        <w:rPr>
+          <w:b/>
+          <w:bCs/>
+          <w:u w:val="single"/>
+        </w:rPr>
+        <w:t xml:space="preserve"> BAIL SOUS CONDITION SUSPENSIVE</w:t>
+      </w:r>
+      <w:r>
+        <w:br/>
+      </w:r>
+      <w:r>
+        <w:br/>
+      </w:r>
+      <w:r>
+        <w:br/>
+      </w:r>
+      <w:r>
+        <w:rPr>
+          <w:rFonts w:ascii="Calibri" w:eastAsia="Times New Roman" w:hAnsi="Calibri" w:cs="Calibri"/>
+          <w:b/>
+          <w:bCs/>
+          <w:shd w:val="clear" w:color="auto" w:fill="FFFFFF"/>
+          <w:lang w:val="fr-FR" w:eastAsia="fr-FR"/>
+        </w:rPr>
+        <w:t xml:space="preserve">1.      </w:t>
+      </w:r>
+      <w:r>
+        <w:rPr>
+          <w:rFonts w:ascii="Calibri" w:eastAsia="Times New Roman" w:hAnsi="Calibri" w:cs="Calibri"/>
+          <w:b/>
+          <w:bCs/>
+          <w:u w:val="single"/>
+          <w:shd w:val="clear" w:color="auto" w:fill="FFFFFF"/>
+          <w:lang w:val="fr-FR" w:eastAsia="fr-FR"/>
+        </w:rPr>
+        <w:t xml:space="preserve">Condition suspensive et </w:t>
+      </w:r>
+      <w:proofErr w:type="spellStart"/>
+      <w:r>
+        <w:rPr>
+          <w:rFonts w:ascii="Calibri" w:eastAsia="Times New Roman" w:hAnsi="Calibri" w:cs="Calibri"/>
+          <w:b/>
+          <w:bCs/>
+          <w:u w:val="single"/>
+          <w:shd w:val="clear" w:color="auto" w:fill="FFFFFF"/>
+          <w:lang w:val="fr-FR" w:eastAsia="fr-FR"/>
+        </w:rPr>
+        <w:t>délais</w:t>
+      </w:r>
+      <w:proofErr w:type="spellEnd"/>
+      <w:r>
+        <w:rPr>
+          <w:rFonts w:ascii="Calibri" w:eastAsia="Times New Roman" w:hAnsi="Calibri" w:cs="Calibri"/>
+          <w:b/>
+          <w:bCs/>
+          <w:u w:val="single"/>
+          <w:shd w:val="clear" w:color="auto" w:fill="FFFFFF"/>
+          <w:lang w:val="fr-FR" w:eastAsia="fr-FR"/>
+        </w:rPr>
+        <w:br/>
+      </w:r>
+      <w:r>
+        <w:br/>
+        <w:t xml:space="preserve">Le </w:t>
+      </w:r>
+      <w:proofErr w:type="spellStart"/>
+      <w:r>
+        <w:t>présent</w:t>
+      </w:r>
+      <w:proofErr w:type="spellEnd"/>
+      <w:r>
+        <w:t xml:space="preserve"> Bail est consenti et accepté par le Bailleur et le Preneur sous réserve de la réalisation de la condition suspensive </w:t>
+      </w:r>
+      <w:proofErr w:type="gramStart"/>
+      <w:r>
+        <w:t>suivante :</w:t>
+      </w:r>
+      <w:proofErr w:type="gramEnd"/>
       <w:r>
         <w:br/>
         <w:t xml:space="preserve"> </w:t>
@@ -1036,10 +1574,32 @@
       </w:r>
       <w:r>
         <w:br/>
-        <w:t>2.      Défaillance de la Condition Suspensive</w:t>
-      </w:r>
-      <w:r>
-        <w:br/>
+      </w:r>
+      <w:r>
+        <w:rPr>
+          <w:rFonts w:ascii="Calibri" w:eastAsia="Times New Roman" w:hAnsi="Calibri" w:cs="Calibri"/>
+          <w:b/>
+          <w:bCs/>
+          <w:shd w:val="clear" w:color="auto" w:fill="FFFFFF"/>
+          <w:lang w:val="fr-FR" w:eastAsia="fr-FR"/>
+        </w:rPr>
+        <w:t xml:space="preserve">2.      </w:t>
+      </w:r>
+      <w:r>
+        <w:rPr>
+          <w:rFonts w:ascii="Calibri" w:eastAsia="Times New Roman" w:hAnsi="Calibri" w:cs="Calibri"/>
+          <w:b/>
+          <w:bCs/>
+          <w:u w:val="single"/>
+          <w:shd w:val="clear" w:color="auto" w:fill="FFFFFF"/>
+          <w:lang w:val="fr-FR" w:eastAsia="fr-FR"/>
+        </w:rPr>
+        <w:t>Défaillance de la Condition Suspensive</w:t>
+      </w:r>
+      <w:r>
+        <w:br/>
+      </w:r>
+      <w:r>
         <w:t xml:space="preserve"> </w:t>
       </w:r>
       <w:r>
@@ -1089,17 +1649,65 @@
     </w:p>
     <w:p>
       <w:r>
-        <w:t>ARTICLE PRELIMINAIRE : BAIL SOUS CONDITIONS SUSPENSIVES</w:t>
-      </w:r>
-      <w:r>
-        <w:br/>
-      </w:r>
-      <w:r>
-        <w:br/>
-      </w:r>
-      <w:r>
-        <w:br/>
-        <w:t>1.      Conditions suspensives et délais</w:t>
+        <w:rPr>
+          <w:b/>
+          <w:bCs/>
+          <w:u w:val="single"/>
+        </w:rPr>
+        <w:t xml:space="preserve">ARTICLE </w:t>
+      </w:r>
+      <w:proofErr w:type="gramStart"/>
+      <w:r>
+        <w:rPr>
+          <w:b/>
+          <w:bCs/>
+          <w:u w:val="single"/>
+        </w:rPr>
+        <w:t>PRELIMINAIRE :</w:t>
+      </w:r>
+      <w:proofErr w:type="gramEnd"/>
+      <w:r>
+        <w:rPr>
+          <w:b/>
+          <w:bCs/>
+          <w:u w:val="single"/>
+        </w:rPr>
+        <w:t xml:space="preserve"> BAIL SOUS CONDITIONS SUSPENSIVES</w:t>
+      </w:r>
+      <w:r>
+        <w:rPr>
+          <w:b/>
+          <w:bCs/>
+          <w:u w:val="single"/>
+        </w:rPr>
+        <w:br/>
+      </w:r>
+      <w:r>
+        <w:br/>
+      </w:r>
+      <w:r>
+        <w:br/>
+      </w:r>
+      <w:r>
+        <w:rPr>
+          <w:rFonts w:ascii="Calibri" w:eastAsia="Times New Roman" w:hAnsi="Calibri" w:cs="Calibri"/>
+          <w:b/>
+          <w:bCs/>
+          <w:shd w:val="clear" w:color="auto" w:fill="FFFFFF"/>
+          <w:lang w:val="fr-FR" w:eastAsia="fr-FR"/>
+        </w:rPr>
+        <w:t xml:space="preserve">1.      </w:t>
+      </w:r>
+      <w:r>
+        <w:rPr>
+          <w:rFonts w:ascii="Calibri" w:eastAsia="Times New Roman" w:hAnsi="Calibri" w:cs="Calibri"/>
+          <w:b/>
+          <w:bCs/>
+          <w:u w:val="single"/>
+          <w:shd w:val="clear" w:color="auto" w:fill="FFFFFF"/>
+          <w:lang w:val="fr-FR" w:eastAsia="fr-FR"/>
+        </w:rPr>
+        <w:t>Condition suspensive et délais</w:t>
       </w:r>
       <w:r>
         <w:br/>
@@ -1156,7 +1764,27 @@
       </w:r>
       <w:r>
         <w:br/>
-        <w:t>2.      Défaillance des Conditions Suspensives</w:t>
+      </w:r>
+      <w:r>
+        <w:rPr>
+          <w:rFonts w:ascii="Calibri" w:eastAsia="Times New Roman" w:hAnsi="Calibri" w:cs="Calibri"/>
+          <w:b/>
+          <w:bCs/>
+          <w:shd w:val="clear" w:color="auto" w:fill="FFFFFF"/>
+          <w:lang w:val="fr-FR" w:eastAsia="fr-FR"/>
+        </w:rPr>
+        <w:t xml:space="preserve">2.      </w:t>
+      </w:r>
+      <w:r>
+        <w:rPr>
+          <w:rFonts w:ascii="Calibri" w:eastAsia="Times New Roman" w:hAnsi="Calibri" w:cs="Calibri"/>
+          <w:b/>
+          <w:bCs/>
+          <w:u w:val="single"/>
+          <w:shd w:val="clear" w:color="auto" w:fill="FFFFFF"/>
+          <w:lang w:val="fr-FR" w:eastAsia="fr-FR"/>
+        </w:rPr>
+        <w:t>Défaillance de la Condition Suspensive</w:t>
       </w:r>
       <w:r>
         <w:br/>
@@ -1164,11 +1792,328 @@
       </w:r>
       <w:r>
         <w:br/>
-        <w:t xml:space="preserve">A défaut de réalisation des Conditions Suspensives dans le délai susvisé, les obligations contractées par chacune des Parties seront caduques, et les Parties reprendront leur pleine et entière liberté sans indemnité de part et d’autre, le Preneur ayant parfaitement connaissance de ce que le présent bail s’inscrit dans un contexte de libération desdits locaux </w:t>
-      </w:r>
+        <w:t xml:space="preserve">A </w:t>
+      </w:r>
+      <w:proofErr w:type="spellStart"/>
+      <w:r>
+        <w:t>défaut</w:t>
+      </w:r>
+      <w:proofErr w:type="spellEnd"/>
+      <w:r>
+        <w:t xml:space="preserve"> de </w:t>
+      </w:r>
+      <w:proofErr w:type="spellStart"/>
+      <w:r>
+        <w:t>réalisation</w:t>
+      </w:r>
+      <w:proofErr w:type="spellEnd"/>
+      <w:r>
+        <w:t xml:space="preserve"> des Conditions </w:t>
+      </w:r>
+      <w:proofErr w:type="spellStart"/>
+      <w:r>
+        <w:t>Suspensives</w:t>
+      </w:r>
+      <w:proofErr w:type="spellEnd"/>
+      <w:r>
+        <w:t xml:space="preserve"> dans le </w:t>
+      </w:r>
+      <w:proofErr w:type="spellStart"/>
+      <w:r>
+        <w:t>délai</w:t>
+      </w:r>
+      <w:proofErr w:type="spellEnd"/>
+      <w:r>
+        <w:t xml:space="preserve"> </w:t>
+      </w:r>
+      <w:proofErr w:type="spellStart"/>
+      <w:r>
+        <w:t>susvisé</w:t>
+      </w:r>
+      <w:proofErr w:type="spellEnd"/>
+      <w:r>
+        <w:t xml:space="preserve">, les obligations </w:t>
+      </w:r>
+      <w:proofErr w:type="spellStart"/>
+      <w:r>
+        <w:t>contractées</w:t>
+      </w:r>
+      <w:proofErr w:type="spellEnd"/>
+      <w:r>
+        <w:t xml:space="preserve"> par </w:t>
+      </w:r>
+      <w:proofErr w:type="spellStart"/>
+      <w:r>
+        <w:t>chacune</w:t>
+      </w:r>
+      <w:proofErr w:type="spellEnd"/>
+      <w:r>
+        <w:t xml:space="preserve"> des Parties </w:t>
+      </w:r>
+      <w:proofErr w:type="spellStart"/>
+      <w:r>
+        <w:t>seront</w:t>
+      </w:r>
+      <w:proofErr w:type="spellEnd"/>
+      <w:r>
+        <w:t xml:space="preserve"> </w:t>
+      </w:r>
+      <w:proofErr w:type="spellStart"/>
+      <w:r>
+        <w:t>caduques</w:t>
+      </w:r>
+      <w:proofErr w:type="spellEnd"/>
+      <w:r>
+        <w:t xml:space="preserve">, et les Parties </w:t>
+      </w:r>
+      <w:proofErr w:type="spellStart"/>
+      <w:r>
+        <w:t>reprendront</w:t>
+      </w:r>
+      <w:proofErr w:type="spellEnd"/>
+      <w:r>
+        <w:t xml:space="preserve"> </w:t>
+      </w:r>
+      <w:proofErr w:type="spellStart"/>
+      <w:r>
+        <w:t>leur</w:t>
+      </w:r>
+      <w:proofErr w:type="spellEnd"/>
+      <w:r>
+        <w:t xml:space="preserve"> </w:t>
+      </w:r>
+      <w:proofErr w:type="spellStart"/>
+      <w:r>
+        <w:t>pleine</w:t>
+      </w:r>
+      <w:proofErr w:type="spellEnd"/>
+      <w:r>
+        <w:t xml:space="preserve"> et </w:t>
+      </w:r>
+      <w:proofErr w:type="spellStart"/>
+      <w:r>
+        <w:t>entière</w:t>
+      </w:r>
+      <w:proofErr w:type="spellEnd"/>
+      <w:r>
+        <w:t xml:space="preserve"> liberté sans </w:t>
+      </w:r>
+      <w:proofErr w:type="spellStart"/>
+      <w:r>
+        <w:t>indemnité</w:t>
+      </w:r>
+      <w:proofErr w:type="spellEnd"/>
+      <w:r>
+        <w:t xml:space="preserve"> de part et </w:t>
+      </w:r>
+      <w:proofErr w:type="spellStart"/>
+      <w:r>
+        <w:t>d’autre</w:t>
+      </w:r>
+      <w:proofErr w:type="spellEnd"/>
+      <w:r>
+        <w:t xml:space="preserve">, le </w:t>
+      </w:r>
+      <w:proofErr w:type="spellStart"/>
+      <w:r>
+        <w:t>Preneur</w:t>
+      </w:r>
+      <w:proofErr w:type="spellEnd"/>
+      <w:r>
+        <w:t xml:space="preserve"> </w:t>
+      </w:r>
+      <w:proofErr w:type="spellStart"/>
+      <w:r>
+        <w:t>ayant</w:t>
+      </w:r>
+      <w:proofErr w:type="spellEnd"/>
+      <w:r>
+        <w:t xml:space="preserve"> </w:t>
+      </w:r>
+      <w:proofErr w:type="spellStart"/>
+      <w:r>
+        <w:t>parfaitement</w:t>
+      </w:r>
+      <w:proofErr w:type="spellEnd"/>
+      <w:r>
+        <w:t xml:space="preserve"> </w:t>
+      </w:r>
+      <w:proofErr w:type="spellStart"/>
+      <w:r>
+        <w:t>connaissance</w:t>
+      </w:r>
+      <w:proofErr w:type="spellEnd"/>
+      <w:r>
+        <w:t xml:space="preserve"> de </w:t>
+      </w:r>
+      <w:proofErr w:type="spellStart"/>
+      <w:r>
+        <w:t>ce</w:t>
+      </w:r>
+      <w:proofErr w:type="spellEnd"/>
+      <w:r>
+        <w:t xml:space="preserve"> </w:t>
+      </w:r>
+      <w:proofErr w:type="spellStart"/>
+      <w:r>
+        <w:t>que</w:t>
+      </w:r>
+      <w:proofErr w:type="spellEnd"/>
+      <w:r>
+        <w:t xml:space="preserve"> le </w:t>
+      </w:r>
+      <w:proofErr w:type="spellStart"/>
+      <w:r>
+        <w:t>présent</w:t>
+      </w:r>
+      <w:proofErr w:type="spellEnd"/>
+      <w:r>
+        <w:t xml:space="preserve"> bail </w:t>
+      </w:r>
+      <w:proofErr w:type="spellStart"/>
+      <w:r>
+        <w:t>s’inscrit</w:t>
+      </w:r>
+      <w:proofErr w:type="spellEnd"/>
+      <w:r>
+        <w:t xml:space="preserve"> dans un </w:t>
+      </w:r>
+      <w:proofErr w:type="spellStart"/>
+      <w:r>
+        <w:t>contexte</w:t>
+      </w:r>
+      <w:proofErr w:type="spellEnd"/>
+      <w:r>
+        <w:t xml:space="preserve"> de </w:t>
+      </w:r>
+      <w:proofErr w:type="spellStart"/>
+      <w:r>
+        <w:t>libération</w:t>
+      </w:r>
+      <w:proofErr w:type="spellEnd"/>
+      <w:r>
+        <w:t xml:space="preserve"> </w:t>
+      </w:r>
+      <w:proofErr w:type="spellStart"/>
+      <w:r>
+        <w:t>desdits</w:t>
+      </w:r>
+      <w:proofErr w:type="spellEnd"/>
+      <w:r>
+        <w:t xml:space="preserve"> </w:t>
+      </w:r>
+      <w:proofErr w:type="spellStart"/>
+      <w:r>
+        <w:t>locaux</w:t>
+      </w:r>
+      <w:proofErr w:type="spellEnd"/>
+      <w:r>
+        <w:t xml:space="preserve"> </w:t>
+      </w:r>
+      <w:proofErr w:type="spellStart"/>
       <w:r>
         <w:lastRenderedPageBreak/>
-        <w:t>laquelle n’est ni garantie et ni prévisible et ne pouvant, à ce titre, engager une quelconque action à l’encontre du Bailleur.</w:t>
+        <w:t>laquelle</w:t>
+      </w:r>
+      <w:proofErr w:type="spellEnd"/>
+      <w:r>
+        <w:t xml:space="preserve"> </w:t>
+      </w:r>
+      <w:proofErr w:type="spellStart"/>
+      <w:r>
+        <w:t>n’est</w:t>
+      </w:r>
+      <w:proofErr w:type="spellEnd"/>
+      <w:r>
+        <w:t xml:space="preserve"> </w:t>
+      </w:r>
+      <w:proofErr w:type="spellStart"/>
+      <w:r>
+        <w:t>ni</w:t>
+      </w:r>
+      <w:proofErr w:type="spellEnd"/>
+      <w:r>
+        <w:t xml:space="preserve"> </w:t>
+      </w:r>
+      <w:proofErr w:type="spellStart"/>
+      <w:r>
+        <w:t>garantie</w:t>
+      </w:r>
+      <w:proofErr w:type="spellEnd"/>
+      <w:r>
+        <w:t xml:space="preserve"> et </w:t>
+      </w:r>
+      <w:proofErr w:type="spellStart"/>
+      <w:r>
+        <w:t>ni</w:t>
+      </w:r>
+      <w:proofErr w:type="spellEnd"/>
+      <w:r>
+        <w:t xml:space="preserve"> </w:t>
+      </w:r>
+      <w:proofErr w:type="spellStart"/>
+      <w:r>
+        <w:t>prévisible</w:t>
+      </w:r>
+      <w:proofErr w:type="spellEnd"/>
+      <w:r>
+        <w:t xml:space="preserve"> et ne </w:t>
+      </w:r>
+      <w:proofErr w:type="spellStart"/>
+      <w:r>
+        <w:t>pouvant</w:t>
+      </w:r>
+      <w:proofErr w:type="spellEnd"/>
+      <w:r>
+        <w:t xml:space="preserve">, à </w:t>
+      </w:r>
+      <w:proofErr w:type="spellStart"/>
+      <w:r>
+        <w:t>ce</w:t>
+      </w:r>
+      <w:proofErr w:type="spellEnd"/>
+      <w:r>
+        <w:t xml:space="preserve"> </w:t>
+      </w:r>
+      <w:proofErr w:type="spellStart"/>
+      <w:r>
+        <w:t>titre</w:t>
+      </w:r>
+      <w:proofErr w:type="spellEnd"/>
+      <w:r>
+        <w:t xml:space="preserve">, engager </w:t>
+      </w:r>
+      <w:proofErr w:type="spellStart"/>
+      <w:r>
+        <w:t>une</w:t>
+      </w:r>
+      <w:proofErr w:type="spellEnd"/>
+      <w:r>
+        <w:t xml:space="preserve"> </w:t>
+      </w:r>
+      <w:proofErr w:type="spellStart"/>
+      <w:r>
+        <w:t>quelconque</w:t>
+      </w:r>
+      <w:proofErr w:type="spellEnd"/>
+      <w:r>
+        <w:t xml:space="preserve"> action à </w:t>
+      </w:r>
+      <w:proofErr w:type="spellStart"/>
+      <w:r>
+        <w:t>l’encontre</w:t>
+      </w:r>
+      <w:proofErr w:type="spellEnd"/>
+      <w:r>
+        <w:t xml:space="preserve"> du </w:t>
+      </w:r>
+      <w:proofErr w:type="spellStart"/>
+      <w:r>
+        <w:t>Bailleur</w:t>
+      </w:r>
+      <w:proofErr w:type="spellEnd"/>
+      <w:r>
+        <w:t>.</w:t>
       </w:r>
       <w:r>
         <w:br/>
@@ -1202,24 +2147,131 @@
     </w:p>
     <w:p>
       <w:r>
-        <w:t>ARTICLE PRELIMINAIRE : BAIL SOUS CONDITION SUSPENSIVE</w:t>
-      </w:r>
-      <w:r>
-        <w:br/>
-      </w:r>
-      <w:r>
-        <w:br/>
-      </w:r>
-      <w:r>
-        <w:br/>
-        <w:t>1.      Condition suspensive et délais</w:t>
-      </w:r>
-      <w:r>
-        <w:br/>
-      </w:r>
-      <w:r>
-        <w:br/>
-        <w:t>Le présent Bail est consenti et accepté par le Bailleur et le Preneur sous réserve de la réalisation de la condition suspensive suivante :</w:t>
+        <w:rPr>
+          <w:b/>
+          <w:bCs/>
+          <w:u w:val="single"/>
+        </w:rPr>
+        <w:t xml:space="preserve">ARTICLE </w:t>
+      </w:r>
+      <w:proofErr w:type="gramStart"/>
+      <w:r>
+        <w:rPr>
+          <w:b/>
+          <w:bCs/>
+          <w:u w:val="single"/>
+        </w:rPr>
+        <w:t>PRELIMINAIRE :</w:t>
+      </w:r>
+      <w:proofErr w:type="gramEnd"/>
+      <w:r>
+        <w:rPr>
+          <w:b/>
+          <w:bCs/>
+          <w:u w:val="single"/>
+        </w:rPr>
+        <w:t xml:space="preserve"> BAIL SOUS CONDITIONS SUSPENSIVES</w:t>
+      </w:r>
+      <w:r>
+        <w:br/>
+      </w:r>
+      <w:r>
+        <w:br/>
+      </w:r>
+      <w:r>
+        <w:br/>
+      </w:r>
+      <w:r>
+        <w:rPr>
+          <w:rFonts w:ascii="Calibri" w:eastAsia="Times New Roman" w:hAnsi="Calibri" w:cs="Calibri"/>
+          <w:b/>
+          <w:bCs/>
+          <w:shd w:val="clear" w:color="auto" w:fill="FFFFFF"/>
+          <w:lang w:val="fr-FR" w:eastAsia="fr-FR"/>
+        </w:rPr>
+        <w:t xml:space="preserve">1.      </w:t>
+      </w:r>
+      <w:r>
+        <w:rPr>
+          <w:rFonts w:ascii="Calibri" w:eastAsia="Times New Roman" w:hAnsi="Calibri" w:cs="Calibri"/>
+          <w:b/>
+          <w:bCs/>
+          <w:u w:val="single"/>
+          <w:shd w:val="clear" w:color="auto" w:fill="FFFFFF"/>
+          <w:lang w:val="fr-FR" w:eastAsia="fr-FR"/>
+        </w:rPr>
+        <w:t>Condition suspensive et délais</w:t>
+      </w:r>
+      <w:r>
+        <w:br/>
+      </w:r>
+      <w:r>
+        <w:br/>
+        <w:t xml:space="preserve">Le </w:t>
+      </w:r>
+      <w:proofErr w:type="spellStart"/>
+      <w:r>
+        <w:t>présent</w:t>
+      </w:r>
+      <w:proofErr w:type="spellEnd"/>
+      <w:r>
+        <w:t xml:space="preserve"> Bail est </w:t>
+      </w:r>
+      <w:proofErr w:type="spellStart"/>
+      <w:r>
+        <w:t>consenti</w:t>
+      </w:r>
+      <w:proofErr w:type="spellEnd"/>
+      <w:r>
+        <w:t xml:space="preserve"> et </w:t>
+      </w:r>
+      <w:proofErr w:type="spellStart"/>
+      <w:r>
+        <w:t>accepté</w:t>
+      </w:r>
+      <w:proofErr w:type="spellEnd"/>
+      <w:r>
+        <w:t xml:space="preserve"> par le </w:t>
+      </w:r>
+      <w:proofErr w:type="spellStart"/>
+      <w:r>
+        <w:t>Bailleur</w:t>
+      </w:r>
+      <w:proofErr w:type="spellEnd"/>
+      <w:r>
+        <w:t xml:space="preserve"> et le </w:t>
+      </w:r>
+      <w:proofErr w:type="spellStart"/>
+      <w:r>
+        <w:t>Preneur</w:t>
+      </w:r>
+      <w:proofErr w:type="spellEnd"/>
+      <w:r>
+        <w:t xml:space="preserve"> sous </w:t>
+      </w:r>
+      <w:proofErr w:type="spellStart"/>
+      <w:r>
+        <w:t>réserve</w:t>
+      </w:r>
+      <w:proofErr w:type="spellEnd"/>
+      <w:r>
+        <w:t xml:space="preserve"> de la </w:t>
+      </w:r>
+      <w:proofErr w:type="spellStart"/>
+      <w:r>
+        <w:t>réalisation</w:t>
+      </w:r>
+      <w:proofErr w:type="spellEnd"/>
+      <w:r>
+        <w:t xml:space="preserve"> de la condition suspensive </w:t>
+      </w:r>
+      <w:proofErr w:type="spellStart"/>
+      <w:r>
+        <w:t>suivante</w:t>
+      </w:r>
+      <w:proofErr w:type="spellEnd"/>
+      <w:r>
+        <w:t xml:space="preserve"> :</w:t>
       </w:r>
       <w:r>
         <w:br/>
@@ -1227,12 +2279,260 @@
       </w:r>
       <w:r>
         <w:br/>
-        <w:t>- Obtention par le Preneur de l'ensemble des autorisations administratives pour la réalisation des travaux nécessaires à la bonne exploitation de son activité et à la mise en place dans les Locaux Loués de son concept, à savoir une Déclaration Préalable pour les modifications de façade, une demande d’Autorisation d’aménager un établissement recevant du public (ERP) ou toute autre autorisation administrative qui s’avérerait indispensable à l’ouverture et à l’exploitation des Locaux Loués au vu de la localisation spécifique de ces derniers. Le Preneur s’engage à justifier au Bailleur du dépôt de ces autorisations administratives au plus tard 1 (UN) mois après la signature des présentes.</w:t>
-      </w:r>
-      <w:r>
-        <w:br/>
+        <w:t xml:space="preserve">- Obtention par le </w:t>
+      </w:r>
+      <w:proofErr w:type="spellStart"/>
+      <w:r>
+        <w:t>Preneur</w:t>
+      </w:r>
+      <w:proofErr w:type="spellEnd"/>
+      <w:r>
+        <w:t xml:space="preserve"> de </w:t>
+      </w:r>
+      <w:proofErr w:type="spellStart"/>
+      <w:r>
+        <w:t>l'ensemble</w:t>
+      </w:r>
+      <w:proofErr w:type="spellEnd"/>
+      <w:r>
+        <w:t xml:space="preserve"> des </w:t>
+      </w:r>
+      <w:proofErr w:type="spellStart"/>
+      <w:r>
+        <w:t>autorisations</w:t>
+      </w:r>
+      <w:proofErr w:type="spellEnd"/>
+      <w:r>
         <w:t xml:space="preserve"> </w:t>
       </w:r>
+      <w:proofErr w:type="spellStart"/>
+      <w:r>
+        <w:t>administratives</w:t>
+      </w:r>
+      <w:proofErr w:type="spellEnd"/>
+      <w:r>
+        <w:t xml:space="preserve"> pour la </w:t>
+      </w:r>
+      <w:proofErr w:type="spellStart"/>
+      <w:r>
+        <w:t>réalisation</w:t>
+      </w:r>
+      <w:proofErr w:type="spellEnd"/>
+      <w:r>
+        <w:t xml:space="preserve"> des travaux </w:t>
+      </w:r>
+      <w:proofErr w:type="spellStart"/>
+      <w:r>
+        <w:t>nécessaires</w:t>
+      </w:r>
+      <w:proofErr w:type="spellEnd"/>
+      <w:r>
+        <w:t xml:space="preserve"> à la bonne exploitation de son </w:t>
+      </w:r>
+      <w:proofErr w:type="spellStart"/>
+      <w:r>
+        <w:t>activité</w:t>
+      </w:r>
+      <w:proofErr w:type="spellEnd"/>
+      <w:r>
+        <w:t xml:space="preserve"> et à la mise </w:t>
+      </w:r>
+      <w:proofErr w:type="spellStart"/>
+      <w:r>
+        <w:t>en</w:t>
+      </w:r>
+      <w:proofErr w:type="spellEnd"/>
+      <w:r>
+        <w:t xml:space="preserve"> place dans les </w:t>
+      </w:r>
+      <w:proofErr w:type="spellStart"/>
+      <w:r>
+        <w:t>Locaux</w:t>
+      </w:r>
+      <w:proofErr w:type="spellEnd"/>
+      <w:r>
+        <w:t xml:space="preserve"> </w:t>
+      </w:r>
+      <w:proofErr w:type="spellStart"/>
+      <w:r>
+        <w:t>Loués</w:t>
+      </w:r>
+      <w:proofErr w:type="spellEnd"/>
+      <w:r>
+        <w:t xml:space="preserve"> de son concept, à savoir </w:t>
+      </w:r>
+      <w:proofErr w:type="spellStart"/>
+      <w:r>
+        <w:t>une</w:t>
+      </w:r>
+      <w:proofErr w:type="spellEnd"/>
+      <w:r>
+        <w:t xml:space="preserve"> </w:t>
+      </w:r>
+      <w:proofErr w:type="spellStart"/>
+      <w:r>
+        <w:t>Déclaration</w:t>
+      </w:r>
+      <w:proofErr w:type="spellEnd"/>
+      <w:r>
+        <w:t xml:space="preserve"> </w:t>
+      </w:r>
+      <w:proofErr w:type="spellStart"/>
+      <w:r>
+        <w:t>Préalable</w:t>
+      </w:r>
+      <w:proofErr w:type="spellEnd"/>
+      <w:r>
+        <w:t xml:space="preserve"> pour les modifications de façade, </w:t>
+      </w:r>
+      <w:proofErr w:type="spellStart"/>
+      <w:r>
+        <w:t>une</w:t>
+      </w:r>
+      <w:proofErr w:type="spellEnd"/>
+      <w:r>
+        <w:t xml:space="preserve"> </w:t>
+      </w:r>
+      <w:proofErr w:type="spellStart"/>
+      <w:r>
+        <w:t>demande</w:t>
+      </w:r>
+      <w:proofErr w:type="spellEnd"/>
+      <w:r>
+        <w:t xml:space="preserve"> </w:t>
+      </w:r>
+      <w:proofErr w:type="spellStart"/>
+      <w:r>
+        <w:t>d’Autorisation</w:t>
+      </w:r>
+      <w:proofErr w:type="spellEnd"/>
+      <w:r>
+        <w:t xml:space="preserve"> </w:t>
+      </w:r>
+      <w:proofErr w:type="spellStart"/>
+      <w:r>
+        <w:t>d’aménager</w:t>
+      </w:r>
+      <w:proofErr w:type="spellEnd"/>
+      <w:r>
+        <w:t xml:space="preserve"> un </w:t>
+      </w:r>
+      <w:proofErr w:type="spellStart"/>
+      <w:r>
+        <w:t>établissement</w:t>
+      </w:r>
+      <w:proofErr w:type="spellEnd"/>
+      <w:r>
+        <w:t xml:space="preserve"> </w:t>
+      </w:r>
+      <w:proofErr w:type="spellStart"/>
+      <w:r>
+        <w:t>recevant</w:t>
+      </w:r>
+      <w:proofErr w:type="spellEnd"/>
+      <w:r>
+        <w:t xml:space="preserve"> du public (ERP) </w:t>
+      </w:r>
+      <w:proofErr w:type="spellStart"/>
+      <w:r>
+        <w:t>ou</w:t>
+      </w:r>
+      <w:proofErr w:type="spellEnd"/>
+      <w:r>
+        <w:t xml:space="preserve"> toute </w:t>
+      </w:r>
+      <w:proofErr w:type="spellStart"/>
+      <w:r>
+        <w:t>autre</w:t>
+      </w:r>
+      <w:proofErr w:type="spellEnd"/>
+      <w:r>
+        <w:t xml:space="preserve"> </w:t>
+      </w:r>
+      <w:proofErr w:type="spellStart"/>
+      <w:r>
+        <w:t>autorisation</w:t>
+      </w:r>
+      <w:proofErr w:type="spellEnd"/>
+      <w:r>
+        <w:t xml:space="preserve"> administrative qui </w:t>
+      </w:r>
+      <w:proofErr w:type="spellStart"/>
+      <w:r>
+        <w:t>s’avérerait</w:t>
+      </w:r>
+      <w:proofErr w:type="spellEnd"/>
+      <w:r>
+        <w:t xml:space="preserve"> indispensable à </w:t>
+      </w:r>
+      <w:proofErr w:type="spellStart"/>
+      <w:r>
+        <w:t>l’ouverture</w:t>
+      </w:r>
+      <w:proofErr w:type="spellEnd"/>
+      <w:r>
+        <w:t xml:space="preserve"> et à </w:t>
+      </w:r>
+      <w:proofErr w:type="spellStart"/>
+      <w:r>
+        <w:t>l’exploitation</w:t>
+      </w:r>
+      <w:proofErr w:type="spellEnd"/>
+      <w:r>
+        <w:t xml:space="preserve"> des </w:t>
+      </w:r>
+      <w:proofErr w:type="spellStart"/>
+      <w:r>
+        <w:t>Locaux</w:t>
+      </w:r>
+      <w:proofErr w:type="spellEnd"/>
+      <w:r>
+        <w:t xml:space="preserve"> </w:t>
+      </w:r>
+      <w:proofErr w:type="spellStart"/>
+      <w:r>
+        <w:t>Loués</w:t>
+      </w:r>
+      <w:proofErr w:type="spellEnd"/>
+      <w:r>
+        <w:t xml:space="preserve"> au vu de la </w:t>
+      </w:r>
+      <w:proofErr w:type="spellStart"/>
+      <w:r>
+        <w:t>localisation</w:t>
+      </w:r>
+      <w:proofErr w:type="spellEnd"/>
+      <w:r>
+        <w:t xml:space="preserve"> </w:t>
+      </w:r>
+      <w:proofErr w:type="spellStart"/>
+      <w:r>
+        <w:t>spécifique</w:t>
+      </w:r>
+      <w:proofErr w:type="spellEnd"/>
+      <w:r>
+        <w:t xml:space="preserve"> de </w:t>
+      </w:r>
+      <w:proofErr w:type="spellStart"/>
+      <w:r>
+        <w:t>ces</w:t>
+      </w:r>
+      <w:proofErr w:type="spellEnd"/>
+      <w:r>
+        <w:t xml:space="preserve"> </w:t>
+      </w:r>
+      <w:proofErr w:type="spellStart"/>
+      <w:r>
+        <w:t>derniers</w:t>
+      </w:r>
+      <w:proofErr w:type="spellEnd"/>
+      <w:r>
+        <w:t>. Le Preneur s’engage à justifier au Bailleur du dépôt de ces autorisations administratives au plus tard 1 (UN) mois après la signature des présentes.</w:t>
+      </w:r>
+      <w:r>
+        <w:br/>
+        <w:t xml:space="preserve"> </w:t>
+      </w:r>
       <w:r>
         <w:br/>
         <w:t>Ci-après la « Condition Suspensive »</w:t>
@@ -1261,7 +2561,27 @@
       </w:r>
       <w:r>
         <w:br/>
-        <w:t>2.      Défaillance de la Condition Suspensive</w:t>
+      </w:r>
+      <w:r>
+        <w:rPr>
+          <w:rFonts w:ascii="Calibri" w:eastAsia="Times New Roman" w:hAnsi="Calibri" w:cs="Calibri"/>
+          <w:b/>
+          <w:bCs/>
+          <w:shd w:val="clear" w:color="auto" w:fill="FFFFFF"/>
+          <w:lang w:val="fr-FR" w:eastAsia="fr-FR"/>
+        </w:rPr>
+        <w:t xml:space="preserve">2.      </w:t>
+      </w:r>
+      <w:r>
+        <w:rPr>
+          <w:rFonts w:ascii="Calibri" w:eastAsia="Times New Roman" w:hAnsi="Calibri" w:cs="Calibri"/>
+          <w:b/>
+          <w:bCs/>
+          <w:u w:val="single"/>
+          <w:shd w:val="clear" w:color="auto" w:fill="FFFFFF"/>
+          <w:lang w:val="fr-FR" w:eastAsia="fr-FR"/>
+        </w:rPr>
+        <w:t>Défaillance de la Condition Suspensive</w:t>
       </w:r>
       <w:r>
         <w:br/>
@@ -1316,17 +2636,60 @@
     </w:p>
     <w:p>
       <w:r>
-        <w:t>ARTICLE PRELIMINAIRE : BAIL SOUS CONDITIONS SUSPENSIVES</w:t>
-      </w:r>
-      <w:r>
-        <w:br/>
-      </w:r>
-      <w:r>
-        <w:br/>
-      </w:r>
-      <w:r>
-        <w:br/>
-        <w:t>1.      Conditions suspensives et délais</w:t>
+        <w:rPr>
+          <w:b/>
+          <w:bCs/>
+          <w:u w:val="single"/>
+        </w:rPr>
+        <w:t xml:space="preserve">ARTICLE </w:t>
+      </w:r>
+      <w:proofErr w:type="gramStart"/>
+      <w:r>
+        <w:rPr>
+          <w:b/>
+          <w:bCs/>
+          <w:u w:val="single"/>
+        </w:rPr>
+        <w:t>PRELIMINAIRE :</w:t>
+      </w:r>
+      <w:proofErr w:type="gramEnd"/>
+      <w:r>
+        <w:rPr>
+          <w:b/>
+          <w:bCs/>
+          <w:u w:val="single"/>
+        </w:rPr>
+        <w:t xml:space="preserve"> BAIL SOUS CONDITIONS SUSPENSIVES</w:t>
+      </w:r>
+      <w:r>
+        <w:br/>
+      </w:r>
+      <w:r>
+        <w:br/>
+      </w:r>
+      <w:r>
+        <w:br/>
+      </w:r>
+      <w:r>
+        <w:rPr>
+          <w:rFonts w:ascii="Calibri" w:eastAsia="Times New Roman" w:hAnsi="Calibri" w:cs="Calibri"/>
+          <w:b/>
+          <w:bCs/>
+          <w:shd w:val="clear" w:color="auto" w:fill="FFFFFF"/>
+          <w:lang w:val="fr-FR" w:eastAsia="fr-FR"/>
+        </w:rPr>
+        <w:t xml:space="preserve">1.      </w:t>
+      </w:r>
+      <w:r>
+        <w:rPr>
+          <w:rFonts w:ascii="Calibri" w:eastAsia="Times New Roman" w:hAnsi="Calibri" w:cs="Calibri"/>
+          <w:b/>
+          <w:bCs/>
+          <w:u w:val="single"/>
+          <w:shd w:val="clear" w:color="auto" w:fill="FFFFFF"/>
+          <w:lang w:val="fr-FR" w:eastAsia="fr-FR"/>
+        </w:rPr>
+        <w:t>Condition suspensive et délais</w:t>
       </w:r>
       <w:r>
         <w:br/>
@@ -1384,7 +2747,27 @@
       </w:r>
       <w:r>
         <w:br/>
-        <w:t>2.      Défaillance des Conditions Suspensives</w:t>
+      </w:r>
+      <w:r>
+        <w:rPr>
+          <w:rFonts w:ascii="Calibri" w:eastAsia="Times New Roman" w:hAnsi="Calibri" w:cs="Calibri"/>
+          <w:b/>
+          <w:bCs/>
+          <w:shd w:val="clear" w:color="auto" w:fill="FFFFFF"/>
+          <w:lang w:val="fr-FR" w:eastAsia="fr-FR"/>
+        </w:rPr>
+        <w:t xml:space="preserve">2.      </w:t>
+      </w:r>
+      <w:r>
+        <w:rPr>
+          <w:rFonts w:ascii="Calibri" w:eastAsia="Times New Roman" w:hAnsi="Calibri" w:cs="Calibri"/>
+          <w:b/>
+          <w:bCs/>
+          <w:u w:val="single"/>
+          <w:shd w:val="clear" w:color="auto" w:fill="FFFFFF"/>
+          <w:lang w:val="fr-FR" w:eastAsia="fr-FR"/>
+        </w:rPr>
+        <w:t>Défaillance de la Condition Suspensive</w:t>
       </w:r>
       <w:r>
         <w:br/>
@@ -1392,7 +2775,327 @@
       </w:r>
       <w:r>
         <w:br/>
-        <w:t>A défaut de réalisation des Conditions Suspensives dans le délai susvisé, les obligations contractées par chacune des Parties seront caduques, et les Parties reprendront leur pleine et entière liberté sans indemnité de part et d’autre, le Preneur ayant parfaitement connaissance de ce que le présent bail s’inscrit dans un contexte de libération desdits locaux laquelle n’est ni garantie et ni prévisible et ne pouvant, à ce titre, engager une quelconque action à l’encontre du Bailleur.</w:t>
+        <w:t xml:space="preserve">A </w:t>
+      </w:r>
+      <w:proofErr w:type="spellStart"/>
+      <w:r>
+        <w:t>défaut</w:t>
+      </w:r>
+      <w:proofErr w:type="spellEnd"/>
+      <w:r>
+        <w:t xml:space="preserve"> de </w:t>
+      </w:r>
+      <w:proofErr w:type="spellStart"/>
+      <w:r>
+        <w:t>réalisation</w:t>
+      </w:r>
+      <w:proofErr w:type="spellEnd"/>
+      <w:r>
+        <w:t xml:space="preserve"> des Conditions </w:t>
+      </w:r>
+      <w:proofErr w:type="spellStart"/>
+      <w:r>
+        <w:t>Suspensives</w:t>
+      </w:r>
+      <w:proofErr w:type="spellEnd"/>
+      <w:r>
+        <w:t xml:space="preserve"> dans le </w:t>
+      </w:r>
+      <w:proofErr w:type="spellStart"/>
+      <w:r>
+        <w:t>délai</w:t>
+      </w:r>
+      <w:proofErr w:type="spellEnd"/>
+      <w:r>
+        <w:t xml:space="preserve"> </w:t>
+      </w:r>
+      <w:proofErr w:type="spellStart"/>
+      <w:r>
+        <w:t>susvisé</w:t>
+      </w:r>
+      <w:proofErr w:type="spellEnd"/>
+      <w:r>
+        <w:t xml:space="preserve">, les obligations </w:t>
+      </w:r>
+      <w:proofErr w:type="spellStart"/>
+      <w:r>
+        <w:t>contractées</w:t>
+      </w:r>
+      <w:proofErr w:type="spellEnd"/>
+      <w:r>
+        <w:t xml:space="preserve"> par </w:t>
+      </w:r>
+      <w:proofErr w:type="spellStart"/>
+      <w:r>
+        <w:t>chacune</w:t>
+      </w:r>
+      <w:proofErr w:type="spellEnd"/>
+      <w:r>
+        <w:t xml:space="preserve"> des Parties </w:t>
+      </w:r>
+      <w:proofErr w:type="spellStart"/>
+      <w:r>
+        <w:t>seront</w:t>
+      </w:r>
+      <w:proofErr w:type="spellEnd"/>
+      <w:r>
+        <w:t xml:space="preserve"> </w:t>
+      </w:r>
+      <w:proofErr w:type="spellStart"/>
+      <w:r>
+        <w:t>caduques</w:t>
+      </w:r>
+      <w:proofErr w:type="spellEnd"/>
+      <w:r>
+        <w:t xml:space="preserve">, et les Parties </w:t>
+      </w:r>
+      <w:proofErr w:type="spellStart"/>
+      <w:r>
+        <w:t>reprendront</w:t>
+      </w:r>
+      <w:proofErr w:type="spellEnd"/>
+      <w:r>
+        <w:t xml:space="preserve"> </w:t>
+      </w:r>
+      <w:proofErr w:type="spellStart"/>
+      <w:r>
+        <w:t>leur</w:t>
+      </w:r>
+      <w:proofErr w:type="spellEnd"/>
+      <w:r>
+        <w:t xml:space="preserve"> </w:t>
+      </w:r>
+      <w:proofErr w:type="spellStart"/>
+      <w:r>
+        <w:t>pleine</w:t>
+      </w:r>
+      <w:proofErr w:type="spellEnd"/>
+      <w:r>
+        <w:t xml:space="preserve"> et </w:t>
+      </w:r>
+      <w:proofErr w:type="spellStart"/>
+      <w:r>
+        <w:t>entière</w:t>
+      </w:r>
+      <w:proofErr w:type="spellEnd"/>
+      <w:r>
+        <w:t xml:space="preserve"> liberté sans </w:t>
+      </w:r>
+      <w:proofErr w:type="spellStart"/>
+      <w:r>
+        <w:t>indemnité</w:t>
+      </w:r>
+      <w:proofErr w:type="spellEnd"/>
+      <w:r>
+        <w:t xml:space="preserve"> de part et </w:t>
+      </w:r>
+      <w:proofErr w:type="spellStart"/>
+      <w:r>
+        <w:t>d’autre</w:t>
+      </w:r>
+      <w:proofErr w:type="spellEnd"/>
+      <w:r>
+        <w:t xml:space="preserve">, le </w:t>
+      </w:r>
+      <w:proofErr w:type="spellStart"/>
+      <w:r>
+        <w:t>Preneur</w:t>
+      </w:r>
+      <w:proofErr w:type="spellEnd"/>
+      <w:r>
+        <w:t xml:space="preserve"> </w:t>
+      </w:r>
+      <w:proofErr w:type="spellStart"/>
+      <w:r>
+        <w:t>ayant</w:t>
+      </w:r>
+      <w:proofErr w:type="spellEnd"/>
+      <w:r>
+        <w:t xml:space="preserve"> </w:t>
+      </w:r>
+      <w:proofErr w:type="spellStart"/>
+      <w:r>
+        <w:t>parfaitement</w:t>
+      </w:r>
+      <w:proofErr w:type="spellEnd"/>
+      <w:r>
+        <w:t xml:space="preserve"> </w:t>
+      </w:r>
+      <w:proofErr w:type="spellStart"/>
+      <w:r>
+        <w:t>connaissance</w:t>
+      </w:r>
+      <w:proofErr w:type="spellEnd"/>
+      <w:r>
+        <w:t xml:space="preserve"> de </w:t>
+      </w:r>
+      <w:proofErr w:type="spellStart"/>
+      <w:r>
+        <w:t>ce</w:t>
+      </w:r>
+      <w:proofErr w:type="spellEnd"/>
+      <w:r>
+        <w:t xml:space="preserve"> </w:t>
+      </w:r>
+      <w:proofErr w:type="spellStart"/>
+      <w:r>
+        <w:t>que</w:t>
+      </w:r>
+      <w:proofErr w:type="spellEnd"/>
+      <w:r>
+        <w:t xml:space="preserve"> le </w:t>
+      </w:r>
+      <w:proofErr w:type="spellStart"/>
+      <w:r>
+        <w:t>présent</w:t>
+      </w:r>
+      <w:proofErr w:type="spellEnd"/>
+      <w:r>
+        <w:t xml:space="preserve"> bail </w:t>
+      </w:r>
+      <w:proofErr w:type="spellStart"/>
+      <w:r>
+        <w:t>s’inscrit</w:t>
+      </w:r>
+      <w:proofErr w:type="spellEnd"/>
+      <w:r>
+        <w:t xml:space="preserve"> dans un </w:t>
+      </w:r>
+      <w:proofErr w:type="spellStart"/>
+      <w:r>
+        <w:t>contexte</w:t>
+      </w:r>
+      <w:proofErr w:type="spellEnd"/>
+      <w:r>
+        <w:t xml:space="preserve"> de </w:t>
+      </w:r>
+      <w:proofErr w:type="spellStart"/>
+      <w:r>
+        <w:t>libération</w:t>
+      </w:r>
+      <w:proofErr w:type="spellEnd"/>
+      <w:r>
+        <w:t xml:space="preserve"> </w:t>
+      </w:r>
+      <w:proofErr w:type="spellStart"/>
+      <w:r>
+        <w:t>desdits</w:t>
+      </w:r>
+      <w:proofErr w:type="spellEnd"/>
+      <w:r>
+        <w:t xml:space="preserve"> </w:t>
+      </w:r>
+      <w:proofErr w:type="spellStart"/>
+      <w:r>
+        <w:t>locaux</w:t>
+      </w:r>
+      <w:proofErr w:type="spellEnd"/>
+      <w:r>
+        <w:t xml:space="preserve"> </w:t>
+      </w:r>
+      <w:proofErr w:type="spellStart"/>
+      <w:r>
+        <w:t>laquelle</w:t>
+      </w:r>
+      <w:proofErr w:type="spellEnd"/>
+      <w:r>
+        <w:t xml:space="preserve"> </w:t>
+      </w:r>
+      <w:proofErr w:type="spellStart"/>
+      <w:r>
+        <w:t>n’est</w:t>
+      </w:r>
+      <w:proofErr w:type="spellEnd"/>
+      <w:r>
+        <w:t xml:space="preserve"> </w:t>
+      </w:r>
+      <w:proofErr w:type="spellStart"/>
+      <w:r>
+        <w:t>ni</w:t>
+      </w:r>
+      <w:proofErr w:type="spellEnd"/>
+      <w:r>
+        <w:t xml:space="preserve"> </w:t>
+      </w:r>
+      <w:proofErr w:type="spellStart"/>
+      <w:r>
+        <w:t>garantie</w:t>
+      </w:r>
+      <w:proofErr w:type="spellEnd"/>
+      <w:r>
+        <w:t xml:space="preserve"> et </w:t>
+      </w:r>
+      <w:proofErr w:type="spellStart"/>
+      <w:r>
+        <w:t>ni</w:t>
+      </w:r>
+      <w:proofErr w:type="spellEnd"/>
+      <w:r>
+        <w:t xml:space="preserve"> </w:t>
+      </w:r>
+      <w:proofErr w:type="spellStart"/>
+      <w:r>
+        <w:t>prévisible</w:t>
+      </w:r>
+      <w:proofErr w:type="spellEnd"/>
+      <w:r>
+        <w:t xml:space="preserve"> et ne </w:t>
+      </w:r>
+      <w:proofErr w:type="spellStart"/>
+      <w:r>
+        <w:t>pouvant</w:t>
+      </w:r>
+      <w:proofErr w:type="spellEnd"/>
+      <w:r>
+        <w:t xml:space="preserve">, à </w:t>
+      </w:r>
+      <w:proofErr w:type="spellStart"/>
+      <w:r>
+        <w:t>ce</w:t>
+      </w:r>
+      <w:proofErr w:type="spellEnd"/>
+      <w:r>
+        <w:t xml:space="preserve"> </w:t>
+      </w:r>
+      <w:proofErr w:type="spellStart"/>
+      <w:r>
+        <w:t>titre</w:t>
+      </w:r>
+      <w:proofErr w:type="spellEnd"/>
+      <w:r>
+        <w:t xml:space="preserve">, engager </w:t>
+      </w:r>
+      <w:proofErr w:type="spellStart"/>
+      <w:r>
+        <w:t>une</w:t>
+      </w:r>
+      <w:proofErr w:type="spellEnd"/>
+      <w:r>
+        <w:t xml:space="preserve"> </w:t>
+      </w:r>
+      <w:proofErr w:type="spellStart"/>
+      <w:r>
+        <w:t>quelconque</w:t>
+      </w:r>
+      <w:proofErr w:type="spellEnd"/>
+      <w:r>
+        <w:t xml:space="preserve"> action à </w:t>
+      </w:r>
+      <w:proofErr w:type="spellStart"/>
+      <w:r>
+        <w:t>l’encontre</w:t>
+      </w:r>
+      <w:proofErr w:type="spellEnd"/>
+      <w:r>
+        <w:t xml:space="preserve"> du </w:t>
+      </w:r>
+      <w:proofErr w:type="spellStart"/>
+      <w:r>
+        <w:t>Bailleur</w:t>
+      </w:r>
+      <w:proofErr w:type="spellEnd"/>
+      <w:r>
+        <w:t>.</w:t>
       </w:r>
       <w:r>
         <w:br/>
@@ -1426,24 +3129,131 @@
     </w:p>
     <w:p>
       <w:r>
-        <w:t>ARTICLE PRELIMINAIRE : BAIL SOUS CONDITION SUSPENSIVE</w:t>
-      </w:r>
-      <w:r>
-        <w:br/>
-      </w:r>
-      <w:r>
-        <w:br/>
-      </w:r>
-      <w:r>
-        <w:br/>
-        <w:t>1.      Condition suspensive et délais</w:t>
-      </w:r>
-      <w:r>
-        <w:br/>
-      </w:r>
-      <w:r>
-        <w:br/>
-        <w:t>Le présent Bail est consenti et accepté par le Bailleur et le Preneur sous réserve de la réalisation de la condition suspensive suivante :</w:t>
+        <w:rPr>
+          <w:b/>
+          <w:bCs/>
+          <w:u w:val="single"/>
+        </w:rPr>
+        <w:t xml:space="preserve">ARTICLE </w:t>
+      </w:r>
+      <w:proofErr w:type="gramStart"/>
+      <w:r>
+        <w:rPr>
+          <w:b/>
+          <w:bCs/>
+          <w:u w:val="single"/>
+        </w:rPr>
+        <w:t>PRELIMINAIRE :</w:t>
+      </w:r>
+      <w:proofErr w:type="gramEnd"/>
+      <w:r>
+        <w:rPr>
+          <w:b/>
+          <w:bCs/>
+          <w:u w:val="single"/>
+        </w:rPr>
+        <w:t xml:space="preserve"> BAIL SOUS CONDITIONS SUSPENSIVES</w:t>
+      </w:r>
+      <w:r>
+        <w:br/>
+      </w:r>
+      <w:r>
+        <w:br/>
+      </w:r>
+      <w:r>
+        <w:br/>
+      </w:r>
+      <w:r>
+        <w:rPr>
+          <w:rFonts w:ascii="Calibri" w:eastAsia="Times New Roman" w:hAnsi="Calibri" w:cs="Calibri"/>
+          <w:b/>
+          <w:bCs/>
+          <w:shd w:val="clear" w:color="auto" w:fill="FFFFFF"/>
+          <w:lang w:val="fr-FR" w:eastAsia="fr-FR"/>
+        </w:rPr>
+        <w:t xml:space="preserve">1.      </w:t>
+      </w:r>
+      <w:r>
+        <w:rPr>
+          <w:rFonts w:ascii="Calibri" w:eastAsia="Times New Roman" w:hAnsi="Calibri" w:cs="Calibri"/>
+          <w:b/>
+          <w:bCs/>
+          <w:u w:val="single"/>
+          <w:shd w:val="clear" w:color="auto" w:fill="FFFFFF"/>
+          <w:lang w:val="fr-FR" w:eastAsia="fr-FR"/>
+        </w:rPr>
+        <w:t>Condition suspensive et délais</w:t>
+      </w:r>
+      <w:r>
+        <w:br/>
+      </w:r>
+      <w:r>
+        <w:br/>
+        <w:t xml:space="preserve">Le </w:t>
+      </w:r>
+      <w:proofErr w:type="spellStart"/>
+      <w:r>
+        <w:t>présent</w:t>
+      </w:r>
+      <w:proofErr w:type="spellEnd"/>
+      <w:r>
+        <w:t xml:space="preserve"> Bail est </w:t>
+      </w:r>
+      <w:proofErr w:type="spellStart"/>
+      <w:r>
+        <w:t>consenti</w:t>
+      </w:r>
+      <w:proofErr w:type="spellEnd"/>
+      <w:r>
+        <w:t xml:space="preserve"> et </w:t>
+      </w:r>
+      <w:proofErr w:type="spellStart"/>
+      <w:r>
+        <w:t>accepté</w:t>
+      </w:r>
+      <w:proofErr w:type="spellEnd"/>
+      <w:r>
+        <w:t xml:space="preserve"> par le </w:t>
+      </w:r>
+      <w:proofErr w:type="spellStart"/>
+      <w:r>
+        <w:t>Bailleur</w:t>
+      </w:r>
+      <w:proofErr w:type="spellEnd"/>
+      <w:r>
+        <w:t xml:space="preserve"> et le </w:t>
+      </w:r>
+      <w:proofErr w:type="spellStart"/>
+      <w:r>
+        <w:t>Preneur</w:t>
+      </w:r>
+      <w:proofErr w:type="spellEnd"/>
+      <w:r>
+        <w:t xml:space="preserve"> sous </w:t>
+      </w:r>
+      <w:proofErr w:type="spellStart"/>
+      <w:r>
+        <w:t>réserve</w:t>
+      </w:r>
+      <w:proofErr w:type="spellEnd"/>
+      <w:r>
+        <w:t xml:space="preserve"> de la </w:t>
+      </w:r>
+      <w:proofErr w:type="spellStart"/>
+      <w:r>
+        <w:t>réalisation</w:t>
+      </w:r>
+      <w:proofErr w:type="spellEnd"/>
+      <w:r>
+        <w:t xml:space="preserve"> de la condition suspensive </w:t>
+      </w:r>
+      <w:proofErr w:type="spellStart"/>
+      <w:r>
+        <w:t>suivante</w:t>
+      </w:r>
+      <w:proofErr w:type="spellEnd"/>
+      <w:r>
+        <w:t xml:space="preserve"> :</w:t>
       </w:r>
       <w:r>
         <w:br/>
@@ -1451,7 +3261,71 @@
       </w:r>
       <w:r>
         <w:br/>
-        <w:t>- Obtention par le bailleur d’une autorisation de copropriété pour la réalisation de travaux d’installation d’un conduit d’extraction extérieur. Cette condition suspensive devra être levée au plus tard le [X] ;</w:t>
+        <w:t xml:space="preserve">- Obtention par le </w:t>
+      </w:r>
+      <w:proofErr w:type="spellStart"/>
+      <w:r>
+        <w:t>bailleur</w:t>
+      </w:r>
+      <w:proofErr w:type="spellEnd"/>
+      <w:r>
+        <w:t xml:space="preserve"> </w:t>
+      </w:r>
+      <w:proofErr w:type="spellStart"/>
+      <w:r>
+        <w:t>d’une</w:t>
+      </w:r>
+      <w:proofErr w:type="spellEnd"/>
+      <w:r>
+        <w:t xml:space="preserve"> </w:t>
+      </w:r>
+      <w:proofErr w:type="spellStart"/>
+      <w:r>
+        <w:t>autorisation</w:t>
+      </w:r>
+      <w:proofErr w:type="spellEnd"/>
+      <w:r>
+        <w:t xml:space="preserve"> de </w:t>
+      </w:r>
+      <w:proofErr w:type="spellStart"/>
+      <w:r>
+        <w:t>copropriété</w:t>
+      </w:r>
+      <w:proofErr w:type="spellEnd"/>
+      <w:r>
+        <w:t xml:space="preserve"> pour la </w:t>
+      </w:r>
+      <w:proofErr w:type="spellStart"/>
+      <w:r>
+        <w:t>réalisation</w:t>
+      </w:r>
+      <w:proofErr w:type="spellEnd"/>
+      <w:r>
+        <w:t xml:space="preserve"> de travaux </w:t>
+      </w:r>
+      <w:proofErr w:type="spellStart"/>
+      <w:r>
+        <w:t>d’installation</w:t>
+      </w:r>
+      <w:proofErr w:type="spellEnd"/>
+      <w:r>
+        <w:t xml:space="preserve"> d’un conduit </w:t>
+      </w:r>
+      <w:proofErr w:type="spellStart"/>
+      <w:r>
+        <w:t>d’extraction</w:t>
+      </w:r>
+      <w:proofErr w:type="spellEnd"/>
+      <w:r>
+        <w:t xml:space="preserve"> </w:t>
+      </w:r>
+      <w:proofErr w:type="spellStart"/>
+      <w:r>
+        <w:t>extérieur</w:t>
+      </w:r>
+      <w:proofErr w:type="spellEnd"/>
+      <w:r>
+        <w:t>. Cette condition suspensive devra être levée au plus tard le [X] ;</w:t>
       </w:r>
       <w:r>
         <w:br/>
@@ -1492,7 +3366,27 @@
       </w:r>
       <w:r>
         <w:br/>
-        <w:t>2.      Défaillance de la Condition Suspensive</w:t>
+      </w:r>
+      <w:r>
+        <w:rPr>
+          <w:rFonts w:ascii="Calibri" w:eastAsia="Times New Roman" w:hAnsi="Calibri" w:cs="Calibri"/>
+          <w:b/>
+          <w:bCs/>
+          <w:shd w:val="clear" w:color="auto" w:fill="FFFFFF"/>
+          <w:lang w:val="fr-FR" w:eastAsia="fr-FR"/>
+        </w:rPr>
+        <w:t xml:space="preserve">2.      </w:t>
+      </w:r>
+      <w:r>
+        <w:rPr>
+          <w:rFonts w:ascii="Calibri" w:eastAsia="Times New Roman" w:hAnsi="Calibri" w:cs="Calibri"/>
+          <w:b/>
+          <w:bCs/>
+          <w:u w:val="single"/>
+          <w:shd w:val="clear" w:color="auto" w:fill="FFFFFF"/>
+          <w:lang w:val="fr-FR" w:eastAsia="fr-FR"/>
+        </w:rPr>
+        <w:t>Défaillance de la Condition Suspensive</w:t>
       </w:r>
       <w:r>
         <w:br/>
@@ -1544,17 +3438,60 @@
     </w:p>
     <w:p>
       <w:r>
-        <w:t>ARTICLE PRELIMINAIRE : BAIL SOUS CONDITIONS SUSPENSIVES</w:t>
-      </w:r>
-      <w:r>
-        <w:br/>
-      </w:r>
-      <w:r>
-        <w:br/>
-      </w:r>
-      <w:r>
-        <w:br/>
-        <w:t>1.      Conditions suspensives et délais</w:t>
+        <w:rPr>
+          <w:b/>
+          <w:bCs/>
+          <w:u w:val="single"/>
+        </w:rPr>
+        <w:t xml:space="preserve">ARTICLE </w:t>
+      </w:r>
+      <w:proofErr w:type="gramStart"/>
+      <w:r>
+        <w:rPr>
+          <w:b/>
+          <w:bCs/>
+          <w:u w:val="single"/>
+        </w:rPr>
+        <w:t>PRELIMINAIRE :</w:t>
+      </w:r>
+      <w:proofErr w:type="gramEnd"/>
+      <w:r>
+        <w:rPr>
+          <w:b/>
+          <w:bCs/>
+          <w:u w:val="single"/>
+        </w:rPr>
+        <w:t xml:space="preserve"> BAIL SOUS CONDITIONS SUSPENSIVES</w:t>
+      </w:r>
+      <w:r>
+        <w:br/>
+      </w:r>
+      <w:r>
+        <w:br/>
+      </w:r>
+      <w:r>
+        <w:br/>
+      </w:r>
+      <w:r>
+        <w:rPr>
+          <w:rFonts w:ascii="Calibri" w:eastAsia="Times New Roman" w:hAnsi="Calibri" w:cs="Calibri"/>
+          <w:b/>
+          <w:bCs/>
+          <w:shd w:val="clear" w:color="auto" w:fill="FFFFFF"/>
+          <w:lang w:val="fr-FR" w:eastAsia="fr-FR"/>
+        </w:rPr>
+        <w:t xml:space="preserve">1.      </w:t>
+      </w:r>
+      <w:r>
+        <w:rPr>
+          <w:rFonts w:ascii="Calibri" w:eastAsia="Times New Roman" w:hAnsi="Calibri" w:cs="Calibri"/>
+          <w:b/>
+          <w:bCs/>
+          <w:u w:val="single"/>
+          <w:shd w:val="clear" w:color="auto" w:fill="FFFFFF"/>
+          <w:lang w:val="fr-FR" w:eastAsia="fr-FR"/>
+        </w:rPr>
+        <w:t>Condition suspensive et délais</w:t>
       </w:r>
       <w:r>
         <w:br/>
@@ -1618,7 +3555,27 @@
       </w:r>
       <w:r>
         <w:br/>
-        <w:t>2.      Défaillance des Conditions Suspensives</w:t>
+      </w:r>
+      <w:r>
+        <w:rPr>
+          <w:rFonts w:ascii="Calibri" w:eastAsia="Times New Roman" w:hAnsi="Calibri" w:cs="Calibri"/>
+          <w:b/>
+          <w:bCs/>
+          <w:shd w:val="clear" w:color="auto" w:fill="FFFFFF"/>
+          <w:lang w:val="fr-FR" w:eastAsia="fr-FR"/>
+        </w:rPr>
+        <w:t xml:space="preserve">2.      </w:t>
+      </w:r>
+      <w:r>
+        <w:rPr>
+          <w:rFonts w:ascii="Calibri" w:eastAsia="Times New Roman" w:hAnsi="Calibri" w:cs="Calibri"/>
+          <w:b/>
+          <w:bCs/>
+          <w:u w:val="single"/>
+          <w:shd w:val="clear" w:color="auto" w:fill="FFFFFF"/>
+          <w:lang w:val="fr-FR" w:eastAsia="fr-FR"/>
+        </w:rPr>
+        <w:t>Défaillance de la Condition Suspensive</w:t>
       </w:r>
       <w:r>
         <w:br/>
@@ -1626,7 +3583,327 @@
       </w:r>
       <w:r>
         <w:br/>
-        <w:t>A défaut de réalisation des Conditions Suspensives dans le délai susvisé, les obligations contractées par chacune des Parties seront caduques, et les Parties reprendront leur pleine et entière liberté sans indemnité de part et d’autre, le Preneur ayant parfaitement connaissance de ce que le présent bail s’inscrit dans un contexte de libération desdits locaux laquelle n’est ni garantie et ni prévisible et ne pouvant, à ce titre, engager une quelconque action à l’encontre du Bailleur.</w:t>
+        <w:t xml:space="preserve">A </w:t>
+      </w:r>
+      <w:proofErr w:type="spellStart"/>
+      <w:r>
+        <w:t>défaut</w:t>
+      </w:r>
+      <w:proofErr w:type="spellEnd"/>
+      <w:r>
+        <w:t xml:space="preserve"> de </w:t>
+      </w:r>
+      <w:proofErr w:type="spellStart"/>
+      <w:r>
+        <w:t>réalisation</w:t>
+      </w:r>
+      <w:proofErr w:type="spellEnd"/>
+      <w:r>
+        <w:t xml:space="preserve"> des Conditions </w:t>
+      </w:r>
+      <w:proofErr w:type="spellStart"/>
+      <w:r>
+        <w:t>Suspensives</w:t>
+      </w:r>
+      <w:proofErr w:type="spellEnd"/>
+      <w:r>
+        <w:t xml:space="preserve"> dans le </w:t>
+      </w:r>
+      <w:proofErr w:type="spellStart"/>
+      <w:r>
+        <w:t>délai</w:t>
+      </w:r>
+      <w:proofErr w:type="spellEnd"/>
+      <w:r>
+        <w:t xml:space="preserve"> </w:t>
+      </w:r>
+      <w:proofErr w:type="spellStart"/>
+      <w:r>
+        <w:t>susvisé</w:t>
+      </w:r>
+      <w:proofErr w:type="spellEnd"/>
+      <w:r>
+        <w:t xml:space="preserve">, les obligations </w:t>
+      </w:r>
+      <w:proofErr w:type="spellStart"/>
+      <w:r>
+        <w:t>contractées</w:t>
+      </w:r>
+      <w:proofErr w:type="spellEnd"/>
+      <w:r>
+        <w:t xml:space="preserve"> par </w:t>
+      </w:r>
+      <w:proofErr w:type="spellStart"/>
+      <w:r>
+        <w:t>chacune</w:t>
+      </w:r>
+      <w:proofErr w:type="spellEnd"/>
+      <w:r>
+        <w:t xml:space="preserve"> des Parties </w:t>
+      </w:r>
+      <w:proofErr w:type="spellStart"/>
+      <w:r>
+        <w:t>seront</w:t>
+      </w:r>
+      <w:proofErr w:type="spellEnd"/>
+      <w:r>
+        <w:t xml:space="preserve"> </w:t>
+      </w:r>
+      <w:proofErr w:type="spellStart"/>
+      <w:r>
+        <w:t>caduques</w:t>
+      </w:r>
+      <w:proofErr w:type="spellEnd"/>
+      <w:r>
+        <w:t xml:space="preserve">, et les Parties </w:t>
+      </w:r>
+      <w:proofErr w:type="spellStart"/>
+      <w:r>
+        <w:t>reprendront</w:t>
+      </w:r>
+      <w:proofErr w:type="spellEnd"/>
+      <w:r>
+        <w:t xml:space="preserve"> </w:t>
+      </w:r>
+      <w:proofErr w:type="spellStart"/>
+      <w:r>
+        <w:t>leur</w:t>
+      </w:r>
+      <w:proofErr w:type="spellEnd"/>
+      <w:r>
+        <w:t xml:space="preserve"> </w:t>
+      </w:r>
+      <w:proofErr w:type="spellStart"/>
+      <w:r>
+        <w:t>pleine</w:t>
+      </w:r>
+      <w:proofErr w:type="spellEnd"/>
+      <w:r>
+        <w:t xml:space="preserve"> et </w:t>
+      </w:r>
+      <w:proofErr w:type="spellStart"/>
+      <w:r>
+        <w:t>entière</w:t>
+      </w:r>
+      <w:proofErr w:type="spellEnd"/>
+      <w:r>
+        <w:t xml:space="preserve"> liberté sans </w:t>
+      </w:r>
+      <w:proofErr w:type="spellStart"/>
+      <w:r>
+        <w:t>indemnité</w:t>
+      </w:r>
+      <w:proofErr w:type="spellEnd"/>
+      <w:r>
+        <w:t xml:space="preserve"> de part et </w:t>
+      </w:r>
+      <w:proofErr w:type="spellStart"/>
+      <w:r>
+        <w:t>d’autre</w:t>
+      </w:r>
+      <w:proofErr w:type="spellEnd"/>
+      <w:r>
+        <w:t xml:space="preserve">, le </w:t>
+      </w:r>
+      <w:proofErr w:type="spellStart"/>
+      <w:r>
+        <w:t>Preneur</w:t>
+      </w:r>
+      <w:proofErr w:type="spellEnd"/>
+      <w:r>
+        <w:t xml:space="preserve"> </w:t>
+      </w:r>
+      <w:proofErr w:type="spellStart"/>
+      <w:r>
+        <w:t>ayant</w:t>
+      </w:r>
+      <w:proofErr w:type="spellEnd"/>
+      <w:r>
+        <w:t xml:space="preserve"> </w:t>
+      </w:r>
+      <w:proofErr w:type="spellStart"/>
+      <w:r>
+        <w:t>parfaitement</w:t>
+      </w:r>
+      <w:proofErr w:type="spellEnd"/>
+      <w:r>
+        <w:t xml:space="preserve"> </w:t>
+      </w:r>
+      <w:proofErr w:type="spellStart"/>
+      <w:r>
+        <w:t>connaissance</w:t>
+      </w:r>
+      <w:proofErr w:type="spellEnd"/>
+      <w:r>
+        <w:t xml:space="preserve"> de </w:t>
+      </w:r>
+      <w:proofErr w:type="spellStart"/>
+      <w:r>
+        <w:t>ce</w:t>
+      </w:r>
+      <w:proofErr w:type="spellEnd"/>
+      <w:r>
+        <w:t xml:space="preserve"> </w:t>
+      </w:r>
+      <w:proofErr w:type="spellStart"/>
+      <w:r>
+        <w:t>que</w:t>
+      </w:r>
+      <w:proofErr w:type="spellEnd"/>
+      <w:r>
+        <w:t xml:space="preserve"> le </w:t>
+      </w:r>
+      <w:proofErr w:type="spellStart"/>
+      <w:r>
+        <w:t>présent</w:t>
+      </w:r>
+      <w:proofErr w:type="spellEnd"/>
+      <w:r>
+        <w:t xml:space="preserve"> bail </w:t>
+      </w:r>
+      <w:proofErr w:type="spellStart"/>
+      <w:r>
+        <w:t>s’inscrit</w:t>
+      </w:r>
+      <w:proofErr w:type="spellEnd"/>
+      <w:r>
+        <w:t xml:space="preserve"> dans un </w:t>
+      </w:r>
+      <w:proofErr w:type="spellStart"/>
+      <w:r>
+        <w:t>contexte</w:t>
+      </w:r>
+      <w:proofErr w:type="spellEnd"/>
+      <w:r>
+        <w:t xml:space="preserve"> de </w:t>
+      </w:r>
+      <w:proofErr w:type="spellStart"/>
+      <w:r>
+        <w:t>libération</w:t>
+      </w:r>
+      <w:proofErr w:type="spellEnd"/>
+      <w:r>
+        <w:t xml:space="preserve"> </w:t>
+      </w:r>
+      <w:proofErr w:type="spellStart"/>
+      <w:r>
+        <w:t>desdits</w:t>
+      </w:r>
+      <w:proofErr w:type="spellEnd"/>
+      <w:r>
+        <w:t xml:space="preserve"> </w:t>
+      </w:r>
+      <w:proofErr w:type="spellStart"/>
+      <w:r>
+        <w:t>locaux</w:t>
+      </w:r>
+      <w:proofErr w:type="spellEnd"/>
+      <w:r>
+        <w:t xml:space="preserve"> </w:t>
+      </w:r>
+      <w:proofErr w:type="spellStart"/>
+      <w:r>
+        <w:t>laquelle</w:t>
+      </w:r>
+      <w:proofErr w:type="spellEnd"/>
+      <w:r>
+        <w:t xml:space="preserve"> </w:t>
+      </w:r>
+      <w:proofErr w:type="spellStart"/>
+      <w:r>
+        <w:t>n’est</w:t>
+      </w:r>
+      <w:proofErr w:type="spellEnd"/>
+      <w:r>
+        <w:t xml:space="preserve"> </w:t>
+      </w:r>
+      <w:proofErr w:type="spellStart"/>
+      <w:r>
+        <w:t>ni</w:t>
+      </w:r>
+      <w:proofErr w:type="spellEnd"/>
+      <w:r>
+        <w:t xml:space="preserve"> </w:t>
+      </w:r>
+      <w:proofErr w:type="spellStart"/>
+      <w:r>
+        <w:t>garantie</w:t>
+      </w:r>
+      <w:proofErr w:type="spellEnd"/>
+      <w:r>
+        <w:t xml:space="preserve"> et </w:t>
+      </w:r>
+      <w:proofErr w:type="spellStart"/>
+      <w:r>
+        <w:t>ni</w:t>
+      </w:r>
+      <w:proofErr w:type="spellEnd"/>
+      <w:r>
+        <w:t xml:space="preserve"> </w:t>
+      </w:r>
+      <w:proofErr w:type="spellStart"/>
+      <w:r>
+        <w:t>prévisible</w:t>
+      </w:r>
+      <w:proofErr w:type="spellEnd"/>
+      <w:r>
+        <w:t xml:space="preserve"> et ne </w:t>
+      </w:r>
+      <w:proofErr w:type="spellStart"/>
+      <w:r>
+        <w:t>pouvant</w:t>
+      </w:r>
+      <w:proofErr w:type="spellEnd"/>
+      <w:r>
+        <w:t xml:space="preserve">, à </w:t>
+      </w:r>
+      <w:proofErr w:type="spellStart"/>
+      <w:r>
+        <w:t>ce</w:t>
+      </w:r>
+      <w:proofErr w:type="spellEnd"/>
+      <w:r>
+        <w:t xml:space="preserve"> </w:t>
+      </w:r>
+      <w:proofErr w:type="spellStart"/>
+      <w:r>
+        <w:t>titre</w:t>
+      </w:r>
+      <w:proofErr w:type="spellEnd"/>
+      <w:r>
+        <w:t xml:space="preserve">, engager </w:t>
+      </w:r>
+      <w:proofErr w:type="spellStart"/>
+      <w:r>
+        <w:t>une</w:t>
+      </w:r>
+      <w:proofErr w:type="spellEnd"/>
+      <w:r>
+        <w:t xml:space="preserve"> </w:t>
+      </w:r>
+      <w:proofErr w:type="spellStart"/>
+      <w:r>
+        <w:t>quelconque</w:t>
+      </w:r>
+      <w:proofErr w:type="spellEnd"/>
+      <w:r>
+        <w:t xml:space="preserve"> action à </w:t>
+      </w:r>
+      <w:proofErr w:type="spellStart"/>
+      <w:r>
+        <w:t>l’encontre</w:t>
+      </w:r>
+      <w:proofErr w:type="spellEnd"/>
+      <w:r>
+        <w:t xml:space="preserve"> du </w:t>
+      </w:r>
+      <w:proofErr w:type="spellStart"/>
+      <w:r>
+        <w:t>Bailleur</w:t>
+      </w:r>
+      <w:proofErr w:type="spellEnd"/>
+      <w:r>
+        <w:t>.</w:t>
       </w:r>
       <w:r>
         <w:br/>
@@ -1660,27 +3937,132 @@
     </w:p>
     <w:p>
       <w:r>
-        <w:t>ARTICLE PRELIMINAIRE : BAIL SOUS CONDITION SUSPENSIVE</w:t>
-      </w:r>
-      <w:r>
-        <w:br/>
-      </w:r>
-      <w:r>
-        <w:br/>
-      </w:r>
-      <w:r>
-        <w:br/>
-      </w:r>
-      <w:r>
+        <w:rPr>
+          <w:b/>
+          <w:bCs/>
+          <w:u w:val="single"/>
+        </w:rPr>
+        <w:t xml:space="preserve">ARTICLE </w:t>
+      </w:r>
+      <w:proofErr w:type="gramStart"/>
+      <w:r>
+        <w:rPr>
+          <w:b/>
+          <w:bCs/>
+          <w:u w:val="single"/>
+        </w:rPr>
+        <w:t>PRELIMINAIRE :</w:t>
+      </w:r>
+      <w:proofErr w:type="gramEnd"/>
+      <w:r>
+        <w:rPr>
+          <w:b/>
+          <w:bCs/>
+          <w:u w:val="single"/>
+        </w:rPr>
+        <w:t xml:space="preserve"> BAIL SOUS CONDITIONS SUSPENSIVES</w:t>
+      </w:r>
+      <w:r>
+        <w:br/>
+      </w:r>
+      <w:r>
+        <w:br/>
+      </w:r>
+      <w:r>
+        <w:br/>
+      </w:r>
+      <w:r>
+        <w:rPr>
+          <w:rFonts w:ascii="Calibri" w:eastAsia="Times New Roman" w:hAnsi="Calibri" w:cs="Calibri"/>
+          <w:b/>
+          <w:bCs/>
+          <w:shd w:val="clear" w:color="auto" w:fill="FFFFFF"/>
+          <w:lang w:val="fr-FR" w:eastAsia="fr-FR"/>
+        </w:rPr>
         <w:lastRenderedPageBreak/>
-        <w:t>1.      Condition suspensive et délais</w:t>
-      </w:r>
-      <w:r>
-        <w:br/>
-      </w:r>
-      <w:r>
-        <w:br/>
-        <w:t>Le présent Bail est consenti et accepté par le Bailleur et le Preneur sous réserve de la réalisation de la condition suspensive suivante :</w:t>
+        <w:t xml:space="preserve">1.      </w:t>
+      </w:r>
+      <w:r>
+        <w:rPr>
+          <w:rFonts w:ascii="Calibri" w:eastAsia="Times New Roman" w:hAnsi="Calibri" w:cs="Calibri"/>
+          <w:b/>
+          <w:bCs/>
+          <w:u w:val="single"/>
+          <w:shd w:val="clear" w:color="auto" w:fill="FFFFFF"/>
+          <w:lang w:val="fr-FR" w:eastAsia="fr-FR"/>
+        </w:rPr>
+        <w:t>Condition suspensive et délais</w:t>
+      </w:r>
+      <w:r>
+        <w:br/>
+      </w:r>
+      <w:r>
+        <w:br/>
+        <w:t xml:space="preserve">Le </w:t>
+      </w:r>
+      <w:proofErr w:type="spellStart"/>
+      <w:r>
+        <w:t>présent</w:t>
+      </w:r>
+      <w:proofErr w:type="spellEnd"/>
+      <w:r>
+        <w:t xml:space="preserve"> Bail est </w:t>
+      </w:r>
+      <w:proofErr w:type="spellStart"/>
+      <w:r>
+        <w:t>consenti</w:t>
+      </w:r>
+      <w:proofErr w:type="spellEnd"/>
+      <w:r>
+        <w:t xml:space="preserve"> et </w:t>
+      </w:r>
+      <w:proofErr w:type="spellStart"/>
+      <w:r>
+        <w:t>accepté</w:t>
+      </w:r>
+      <w:proofErr w:type="spellEnd"/>
+      <w:r>
+        <w:t xml:space="preserve"> par le </w:t>
+      </w:r>
+      <w:proofErr w:type="spellStart"/>
+      <w:r>
+        <w:t>Bailleur</w:t>
+      </w:r>
+      <w:proofErr w:type="spellEnd"/>
+      <w:r>
+        <w:t xml:space="preserve"> et le </w:t>
+      </w:r>
+      <w:proofErr w:type="spellStart"/>
+      <w:r>
+        <w:t>Preneur</w:t>
+      </w:r>
+      <w:proofErr w:type="spellEnd"/>
+      <w:r>
+        <w:t xml:space="preserve"> sous </w:t>
+      </w:r>
+      <w:proofErr w:type="spellStart"/>
+      <w:r>
+        <w:t>réserve</w:t>
+      </w:r>
+      <w:proofErr w:type="spellEnd"/>
+      <w:r>
+        <w:t xml:space="preserve"> de la </w:t>
+      </w:r>
+      <w:proofErr w:type="spellStart"/>
+      <w:r>
+        <w:t>réalisation</w:t>
+      </w:r>
+      <w:proofErr w:type="spellEnd"/>
+      <w:r>
+        <w:t xml:space="preserve"> de la condition suspensive </w:t>
+      </w:r>
+      <w:proofErr w:type="spellStart"/>
+      <w:r>
+        <w:t>suivante</w:t>
+      </w:r>
+      <w:proofErr w:type="spellEnd"/>
+      <w:r>
+        <w:t xml:space="preserve"> :</w:t>
       </w:r>
       <w:r>
         <w:br/>
@@ -1688,7 +4070,71 @@
       </w:r>
       <w:r>
         <w:br/>
-        <w:t>- Libération effective des Locaux Loués par l’actuel occupant, étant précisé que l’occupant a donné congé pour le [X].</w:t>
+        <w:t xml:space="preserve">- Libération effective des </w:t>
+      </w:r>
+      <w:proofErr w:type="spellStart"/>
+      <w:r>
+        <w:t>Locaux</w:t>
+      </w:r>
+      <w:proofErr w:type="spellEnd"/>
+      <w:r>
+        <w:t xml:space="preserve"> </w:t>
+      </w:r>
+      <w:proofErr w:type="spellStart"/>
+      <w:r>
+        <w:t>Loués</w:t>
+      </w:r>
+      <w:proofErr w:type="spellEnd"/>
+      <w:r>
+        <w:t xml:space="preserve"> par </w:t>
+      </w:r>
+      <w:proofErr w:type="spellStart"/>
+      <w:r>
+        <w:t>l’actuel</w:t>
+      </w:r>
+      <w:proofErr w:type="spellEnd"/>
+      <w:r>
+        <w:t xml:space="preserve"> occupant, </w:t>
+      </w:r>
+      <w:proofErr w:type="spellStart"/>
+      <w:r>
+        <w:t>étant</w:t>
+      </w:r>
+      <w:proofErr w:type="spellEnd"/>
+      <w:r>
+        <w:t xml:space="preserve"> </w:t>
+      </w:r>
+      <w:proofErr w:type="spellStart"/>
+      <w:r>
+        <w:t>précisé</w:t>
+      </w:r>
+      <w:proofErr w:type="spellEnd"/>
+      <w:r>
+        <w:t xml:space="preserve"> </w:t>
+      </w:r>
+      <w:proofErr w:type="spellStart"/>
+      <w:r>
+        <w:t>que</w:t>
+      </w:r>
+      <w:proofErr w:type="spellEnd"/>
+      <w:r>
+        <w:t xml:space="preserve"> </w:t>
+      </w:r>
+      <w:proofErr w:type="spellStart"/>
+      <w:r>
+        <w:t>l’occupant</w:t>
+      </w:r>
+      <w:proofErr w:type="spellEnd"/>
+      <w:r>
+        <w:t xml:space="preserve"> a </w:t>
+      </w:r>
+      <w:proofErr w:type="spellStart"/>
+      <w:r>
+        <w:t>donné</w:t>
+      </w:r>
+      <w:proofErr w:type="spellEnd"/>
+      <w:r>
+        <w:t xml:space="preserve"> congé pour le [X].</w:t>
       </w:r>
       <w:r>
         <w:br/>
@@ -1721,7 +4167,27 @@
       </w:r>
       <w:r>
         <w:br/>
-        <w:t>2.      Défaillance de la Condition Suspensive</w:t>
+      </w:r>
+      <w:r>
+        <w:rPr>
+          <w:rFonts w:ascii="Calibri" w:eastAsia="Times New Roman" w:hAnsi="Calibri" w:cs="Calibri"/>
+          <w:b/>
+          <w:bCs/>
+          <w:shd w:val="clear" w:color="auto" w:fill="FFFFFF"/>
+          <w:lang w:val="fr-FR" w:eastAsia="fr-FR"/>
+        </w:rPr>
+        <w:t xml:space="preserve">2.      </w:t>
+      </w:r>
+      <w:r>
+        <w:rPr>
+          <w:rFonts w:ascii="Calibri" w:eastAsia="Times New Roman" w:hAnsi="Calibri" w:cs="Calibri"/>
+          <w:b/>
+          <w:bCs/>
+          <w:u w:val="single"/>
+          <w:shd w:val="clear" w:color="auto" w:fill="FFFFFF"/>
+          <w:lang w:val="fr-FR" w:eastAsia="fr-FR"/>
+        </w:rPr>
+        <w:t>Défaillance de la Condition Suspensive</w:t>
       </w:r>
       <w:r>
         <w:br/>
@@ -1773,7 +4239,30 @@
     </w:p>
     <w:p>
       <w:r>
-        <w:t>ARTICLE PRELIMINAIRE : BAIL SOUS CONDITIONS SUSPENSIVES</w:t>
+        <w:rPr>
+          <w:b/>
+          <w:bCs/>
+          <w:u w:val="single"/>
+        </w:rPr>
+        <w:t xml:space="preserve">ARTICLE </w:t>
+      </w:r>
+      <w:proofErr w:type="gramStart"/>
+      <w:r>
+        <w:rPr>
+          <w:b/>
+          <w:bCs/>
+          <w:u w:val="single"/>
+        </w:rPr>
+        <w:t>PRELIMINAIRE :</w:t>
+      </w:r>
+      <w:proofErr w:type="gramEnd"/>
+      <w:r>
+        <w:rPr>
+          <w:b/>
+          <w:bCs/>
+          <w:u w:val="single"/>
+        </w:rPr>
+        <w:t xml:space="preserve"> BAIL SOUS CONDITIONS SUSPENSIVES</w:t>
       </w:r>
       <w:r>
         <w:br/>
@@ -1784,19 +4273,111 @@
       <w:r>
         <w:lastRenderedPageBreak/>
         <w:br/>
-        <w:t>1.      Conditions suspensives et délais</w:t>
-      </w:r>
-      <w:r>
-        <w:br/>
-      </w:r>
-      <w:r>
-        <w:br/>
-        <w:t>Le présent Bail est consenti et accepté par le Bailleur et le Preneur sous réserve de la réalisation des conditions suspensives suivantes :</w:t>
-      </w:r>
-      <w:r>
-        <w:br/>
+      </w:r>
+      <w:r>
+        <w:rPr>
+          <w:rFonts w:ascii="Calibri" w:eastAsia="Times New Roman" w:hAnsi="Calibri" w:cs="Calibri"/>
+          <w:b/>
+          <w:bCs/>
+          <w:shd w:val="clear" w:color="auto" w:fill="FFFFFF"/>
+          <w:lang w:val="fr-FR" w:eastAsia="fr-FR"/>
+        </w:rPr>
+        <w:t xml:space="preserve">1.      </w:t>
+      </w:r>
+      <w:r>
+        <w:rPr>
+          <w:rFonts w:ascii="Calibri" w:eastAsia="Times New Roman" w:hAnsi="Calibri" w:cs="Calibri"/>
+          <w:b/>
+          <w:bCs/>
+          <w:u w:val="single"/>
+          <w:shd w:val="clear" w:color="auto" w:fill="FFFFFF"/>
+          <w:lang w:val="fr-FR" w:eastAsia="fr-FR"/>
+        </w:rPr>
+        <w:t>Condition suspensive et délais</w:t>
+      </w:r>
+      <w:r>
+        <w:br/>
+      </w:r>
+      <w:r>
+        <w:br/>
+        <w:t xml:space="preserve">Le </w:t>
+      </w:r>
+      <w:proofErr w:type="spellStart"/>
+      <w:r>
+        <w:t>présent</w:t>
+      </w:r>
+      <w:proofErr w:type="spellEnd"/>
+      <w:r>
+        <w:t xml:space="preserve"> Bail est </w:t>
+      </w:r>
+      <w:proofErr w:type="spellStart"/>
+      <w:r>
+        <w:t>consenti</w:t>
+      </w:r>
+      <w:proofErr w:type="spellEnd"/>
+      <w:r>
+        <w:t xml:space="preserve"> et </w:t>
+      </w:r>
+      <w:proofErr w:type="spellStart"/>
+      <w:r>
+        <w:t>accepté</w:t>
+      </w:r>
+      <w:proofErr w:type="spellEnd"/>
+      <w:r>
+        <w:t xml:space="preserve"> par le </w:t>
+      </w:r>
+      <w:proofErr w:type="spellStart"/>
+      <w:r>
+        <w:t>Bailleur</w:t>
+      </w:r>
+      <w:proofErr w:type="spellEnd"/>
+      <w:r>
+        <w:t xml:space="preserve"> et le </w:t>
+      </w:r>
+      <w:proofErr w:type="spellStart"/>
+      <w:r>
+        <w:t>Preneur</w:t>
+      </w:r>
+      <w:proofErr w:type="spellEnd"/>
+      <w:r>
+        <w:t xml:space="preserve"> sous </w:t>
+      </w:r>
+      <w:proofErr w:type="spellStart"/>
+      <w:r>
+        <w:t>réserve</w:t>
+      </w:r>
+      <w:proofErr w:type="spellEnd"/>
+      <w:r>
+        <w:t xml:space="preserve"> de la </w:t>
+      </w:r>
+      <w:proofErr w:type="spellStart"/>
+      <w:r>
+        <w:t>réalisation</w:t>
+      </w:r>
+      <w:proofErr w:type="spellEnd"/>
+      <w:r>
+        <w:t xml:space="preserve"> des conditions </w:t>
+      </w:r>
+      <w:proofErr w:type="spellStart"/>
+      <w:r>
+        <w:t>suspensives</w:t>
+      </w:r>
+      <w:proofErr w:type="spellEnd"/>
+      <w:r>
         <w:t xml:space="preserve"> </w:t>
       </w:r>
+      <w:proofErr w:type="spellStart"/>
+      <w:r>
+        <w:t>suivantes</w:t>
+      </w:r>
+      <w:proofErr w:type="spellEnd"/>
+      <w:r>
+        <w:t xml:space="preserve"> :</w:t>
+      </w:r>
+      <w:r>
+        <w:br/>
+        <w:t xml:space="preserve"> </w:t>
+      </w:r>
       <w:r>
         <w:br/>
         <w:t>a.      Libération effective des Locaux Loués par l’actuel occupant, étant précisé que l’occupant a donné congé pour le [X] ;</w:t>
@@ -1841,7 +4422,27 @@
       </w:r>
       <w:r>
         <w:br/>
-        <w:t>2.      Défaillance des Conditions Suspensives</w:t>
+      </w:r>
+      <w:r>
+        <w:rPr>
+          <w:rFonts w:ascii="Calibri" w:eastAsia="Times New Roman" w:hAnsi="Calibri" w:cs="Calibri"/>
+          <w:b/>
+          <w:bCs/>
+          <w:shd w:val="clear" w:color="auto" w:fill="FFFFFF"/>
+          <w:lang w:val="fr-FR" w:eastAsia="fr-FR"/>
+        </w:rPr>
+        <w:t xml:space="preserve">2.      </w:t>
+      </w:r>
+      <w:r>
+        <w:rPr>
+          <w:rFonts w:ascii="Calibri" w:eastAsia="Times New Roman" w:hAnsi="Calibri" w:cs="Calibri"/>
+          <w:b/>
+          <w:bCs/>
+          <w:u w:val="single"/>
+          <w:shd w:val="clear" w:color="auto" w:fill="FFFFFF"/>
+          <w:lang w:val="fr-FR" w:eastAsia="fr-FR"/>
+        </w:rPr>
+        <w:t>Défaillance de la Condition Suspensive</w:t>
       </w:r>
       <w:r>
         <w:br/>
@@ -1849,7 +4450,327 @@
       </w:r>
       <w:r>
         <w:br/>
-        <w:t>A défaut de réalisation des Conditions Suspensives dans le délai susvisé, les obligations contractées par chacune des Parties seront caduques, et les Parties reprendront leur pleine et entière liberté sans indemnité de part et d’autre, le Preneur ayant parfaitement connaissance de ce que le présent bail s’inscrit dans un contexte de libération desdits locaux laquelle n’est ni garantie et ni prévisible et ne pouvant, à ce titre, engager une quelconque action à l’encontre du Bailleur.</w:t>
+        <w:t xml:space="preserve">A </w:t>
+      </w:r>
+      <w:proofErr w:type="spellStart"/>
+      <w:r>
+        <w:t>défaut</w:t>
+      </w:r>
+      <w:proofErr w:type="spellEnd"/>
+      <w:r>
+        <w:t xml:space="preserve"> de </w:t>
+      </w:r>
+      <w:proofErr w:type="spellStart"/>
+      <w:r>
+        <w:t>réalisation</w:t>
+      </w:r>
+      <w:proofErr w:type="spellEnd"/>
+      <w:r>
+        <w:t xml:space="preserve"> des Conditions </w:t>
+      </w:r>
+      <w:proofErr w:type="spellStart"/>
+      <w:r>
+        <w:t>Suspensives</w:t>
+      </w:r>
+      <w:proofErr w:type="spellEnd"/>
+      <w:r>
+        <w:t xml:space="preserve"> dans le </w:t>
+      </w:r>
+      <w:proofErr w:type="spellStart"/>
+      <w:r>
+        <w:t>délai</w:t>
+      </w:r>
+      <w:proofErr w:type="spellEnd"/>
+      <w:r>
+        <w:t xml:space="preserve"> </w:t>
+      </w:r>
+      <w:proofErr w:type="spellStart"/>
+      <w:r>
+        <w:t>susvisé</w:t>
+      </w:r>
+      <w:proofErr w:type="spellEnd"/>
+      <w:r>
+        <w:t xml:space="preserve">, les obligations </w:t>
+      </w:r>
+      <w:proofErr w:type="spellStart"/>
+      <w:r>
+        <w:t>contractées</w:t>
+      </w:r>
+      <w:proofErr w:type="spellEnd"/>
+      <w:r>
+        <w:t xml:space="preserve"> par </w:t>
+      </w:r>
+      <w:proofErr w:type="spellStart"/>
+      <w:r>
+        <w:t>chacune</w:t>
+      </w:r>
+      <w:proofErr w:type="spellEnd"/>
+      <w:r>
+        <w:t xml:space="preserve"> des Parties </w:t>
+      </w:r>
+      <w:proofErr w:type="spellStart"/>
+      <w:r>
+        <w:t>seront</w:t>
+      </w:r>
+      <w:proofErr w:type="spellEnd"/>
+      <w:r>
+        <w:t xml:space="preserve"> </w:t>
+      </w:r>
+      <w:proofErr w:type="spellStart"/>
+      <w:r>
+        <w:t>caduques</w:t>
+      </w:r>
+      <w:proofErr w:type="spellEnd"/>
+      <w:r>
+        <w:t xml:space="preserve">, et les Parties </w:t>
+      </w:r>
+      <w:proofErr w:type="spellStart"/>
+      <w:r>
+        <w:t>reprendront</w:t>
+      </w:r>
+      <w:proofErr w:type="spellEnd"/>
+      <w:r>
+        <w:t xml:space="preserve"> </w:t>
+      </w:r>
+      <w:proofErr w:type="spellStart"/>
+      <w:r>
+        <w:t>leur</w:t>
+      </w:r>
+      <w:proofErr w:type="spellEnd"/>
+      <w:r>
+        <w:t xml:space="preserve"> </w:t>
+      </w:r>
+      <w:proofErr w:type="spellStart"/>
+      <w:r>
+        <w:t>pleine</w:t>
+      </w:r>
+      <w:proofErr w:type="spellEnd"/>
+      <w:r>
+        <w:t xml:space="preserve"> et </w:t>
+      </w:r>
+      <w:proofErr w:type="spellStart"/>
+      <w:r>
+        <w:t>entière</w:t>
+      </w:r>
+      <w:proofErr w:type="spellEnd"/>
+      <w:r>
+        <w:t xml:space="preserve"> liberté sans </w:t>
+      </w:r>
+      <w:proofErr w:type="spellStart"/>
+      <w:r>
+        <w:t>indemnité</w:t>
+      </w:r>
+      <w:proofErr w:type="spellEnd"/>
+      <w:r>
+        <w:t xml:space="preserve"> de part et </w:t>
+      </w:r>
+      <w:proofErr w:type="spellStart"/>
+      <w:r>
+        <w:t>d’autre</w:t>
+      </w:r>
+      <w:proofErr w:type="spellEnd"/>
+      <w:r>
+        <w:t xml:space="preserve">, le </w:t>
+      </w:r>
+      <w:proofErr w:type="spellStart"/>
+      <w:r>
+        <w:t>Preneur</w:t>
+      </w:r>
+      <w:proofErr w:type="spellEnd"/>
+      <w:r>
+        <w:t xml:space="preserve"> </w:t>
+      </w:r>
+      <w:proofErr w:type="spellStart"/>
+      <w:r>
+        <w:t>ayant</w:t>
+      </w:r>
+      <w:proofErr w:type="spellEnd"/>
+      <w:r>
+        <w:t xml:space="preserve"> </w:t>
+      </w:r>
+      <w:proofErr w:type="spellStart"/>
+      <w:r>
+        <w:t>parfaitement</w:t>
+      </w:r>
+      <w:proofErr w:type="spellEnd"/>
+      <w:r>
+        <w:t xml:space="preserve"> </w:t>
+      </w:r>
+      <w:proofErr w:type="spellStart"/>
+      <w:r>
+        <w:t>connaissance</w:t>
+      </w:r>
+      <w:proofErr w:type="spellEnd"/>
+      <w:r>
+        <w:t xml:space="preserve"> de </w:t>
+      </w:r>
+      <w:proofErr w:type="spellStart"/>
+      <w:r>
+        <w:t>ce</w:t>
+      </w:r>
+      <w:proofErr w:type="spellEnd"/>
+      <w:r>
+        <w:t xml:space="preserve"> </w:t>
+      </w:r>
+      <w:proofErr w:type="spellStart"/>
+      <w:r>
+        <w:t>que</w:t>
+      </w:r>
+      <w:proofErr w:type="spellEnd"/>
+      <w:r>
+        <w:t xml:space="preserve"> le </w:t>
+      </w:r>
+      <w:proofErr w:type="spellStart"/>
+      <w:r>
+        <w:t>présent</w:t>
+      </w:r>
+      <w:proofErr w:type="spellEnd"/>
+      <w:r>
+        <w:t xml:space="preserve"> bail </w:t>
+      </w:r>
+      <w:proofErr w:type="spellStart"/>
+      <w:r>
+        <w:t>s’inscrit</w:t>
+      </w:r>
+      <w:proofErr w:type="spellEnd"/>
+      <w:r>
+        <w:t xml:space="preserve"> dans un </w:t>
+      </w:r>
+      <w:proofErr w:type="spellStart"/>
+      <w:r>
+        <w:t>contexte</w:t>
+      </w:r>
+      <w:proofErr w:type="spellEnd"/>
+      <w:r>
+        <w:t xml:space="preserve"> de </w:t>
+      </w:r>
+      <w:proofErr w:type="spellStart"/>
+      <w:r>
+        <w:t>libération</w:t>
+      </w:r>
+      <w:proofErr w:type="spellEnd"/>
+      <w:r>
+        <w:t xml:space="preserve"> </w:t>
+      </w:r>
+      <w:proofErr w:type="spellStart"/>
+      <w:r>
+        <w:t>desdits</w:t>
+      </w:r>
+      <w:proofErr w:type="spellEnd"/>
+      <w:r>
+        <w:t xml:space="preserve"> </w:t>
+      </w:r>
+      <w:proofErr w:type="spellStart"/>
+      <w:r>
+        <w:t>locaux</w:t>
+      </w:r>
+      <w:proofErr w:type="spellEnd"/>
+      <w:r>
+        <w:t xml:space="preserve"> </w:t>
+      </w:r>
+      <w:proofErr w:type="spellStart"/>
+      <w:r>
+        <w:t>laquelle</w:t>
+      </w:r>
+      <w:proofErr w:type="spellEnd"/>
+      <w:r>
+        <w:t xml:space="preserve"> </w:t>
+      </w:r>
+      <w:proofErr w:type="spellStart"/>
+      <w:r>
+        <w:t>n’est</w:t>
+      </w:r>
+      <w:proofErr w:type="spellEnd"/>
+      <w:r>
+        <w:t xml:space="preserve"> </w:t>
+      </w:r>
+      <w:proofErr w:type="spellStart"/>
+      <w:r>
+        <w:t>ni</w:t>
+      </w:r>
+      <w:proofErr w:type="spellEnd"/>
+      <w:r>
+        <w:t xml:space="preserve"> </w:t>
+      </w:r>
+      <w:proofErr w:type="spellStart"/>
+      <w:r>
+        <w:t>garantie</w:t>
+      </w:r>
+      <w:proofErr w:type="spellEnd"/>
+      <w:r>
+        <w:t xml:space="preserve"> et </w:t>
+      </w:r>
+      <w:proofErr w:type="spellStart"/>
+      <w:r>
+        <w:t>ni</w:t>
+      </w:r>
+      <w:proofErr w:type="spellEnd"/>
+      <w:r>
+        <w:t xml:space="preserve"> </w:t>
+      </w:r>
+      <w:proofErr w:type="spellStart"/>
+      <w:r>
+        <w:t>prévisible</w:t>
+      </w:r>
+      <w:proofErr w:type="spellEnd"/>
+      <w:r>
+        <w:t xml:space="preserve"> et ne </w:t>
+      </w:r>
+      <w:proofErr w:type="spellStart"/>
+      <w:r>
+        <w:t>pouvant</w:t>
+      </w:r>
+      <w:proofErr w:type="spellEnd"/>
+      <w:r>
+        <w:t xml:space="preserve">, à </w:t>
+      </w:r>
+      <w:proofErr w:type="spellStart"/>
+      <w:r>
+        <w:t>ce</w:t>
+      </w:r>
+      <w:proofErr w:type="spellEnd"/>
+      <w:r>
+        <w:t xml:space="preserve"> </w:t>
+      </w:r>
+      <w:proofErr w:type="spellStart"/>
+      <w:r>
+        <w:t>titre</w:t>
+      </w:r>
+      <w:proofErr w:type="spellEnd"/>
+      <w:r>
+        <w:t xml:space="preserve">, engager </w:t>
+      </w:r>
+      <w:proofErr w:type="spellStart"/>
+      <w:r>
+        <w:t>une</w:t>
+      </w:r>
+      <w:proofErr w:type="spellEnd"/>
+      <w:r>
+        <w:t xml:space="preserve"> </w:t>
+      </w:r>
+      <w:proofErr w:type="spellStart"/>
+      <w:r>
+        <w:t>quelconque</w:t>
+      </w:r>
+      <w:proofErr w:type="spellEnd"/>
+      <w:r>
+        <w:t xml:space="preserve"> action à </w:t>
+      </w:r>
+      <w:proofErr w:type="spellStart"/>
+      <w:r>
+        <w:t>l’encontre</w:t>
+      </w:r>
+      <w:proofErr w:type="spellEnd"/>
+      <w:r>
+        <w:t xml:space="preserve"> du </w:t>
+      </w:r>
+      <w:proofErr w:type="spellStart"/>
+      <w:r>
+        <w:t>Bailleur</w:t>
+      </w:r>
+      <w:proofErr w:type="spellEnd"/>
+      <w:r>
+        <w:t>.</w:t>
       </w:r>
       <w:r>
         <w:br/>
@@ -1883,18 +4804,61 @@
     </w:p>
     <w:p>
       <w:r>
+        <w:rPr>
+          <w:b/>
+          <w:bCs/>
+          <w:u w:val="single"/>
+        </w:rPr>
         <w:lastRenderedPageBreak/>
-        <w:t>ARTICLE PRELIMINAIRE : BAIL SOUS CONDITION SUSPENSIVE</w:t>
-      </w:r>
-      <w:r>
-        <w:br/>
-      </w:r>
-      <w:r>
-        <w:br/>
-      </w:r>
-      <w:r>
-        <w:br/>
-        <w:t>1.      Condition suspensive et délais</w:t>
+        <w:t xml:space="preserve">ARTICLE </w:t>
+      </w:r>
+      <w:proofErr w:type="gramStart"/>
+      <w:r>
+        <w:rPr>
+          <w:b/>
+          <w:bCs/>
+          <w:u w:val="single"/>
+        </w:rPr>
+        <w:t>PRELIMINAIRE :</w:t>
+      </w:r>
+      <w:proofErr w:type="gramEnd"/>
+      <w:r>
+        <w:rPr>
+          <w:b/>
+          <w:bCs/>
+          <w:u w:val="single"/>
+        </w:rPr>
+        <w:t xml:space="preserve"> BAIL SOUS CONDITIONS SUSPENSIVES</w:t>
+      </w:r>
+      <w:r>
+        <w:br/>
+      </w:r>
+      <w:r>
+        <w:br/>
+      </w:r>
+      <w:r>
+        <w:br/>
+      </w:r>
+      <w:r>
+        <w:rPr>
+          <w:rFonts w:ascii="Calibri" w:eastAsia="Times New Roman" w:hAnsi="Calibri" w:cs="Calibri"/>
+          <w:b/>
+          <w:bCs/>
+          <w:shd w:val="clear" w:color="auto" w:fill="FFFFFF"/>
+          <w:lang w:val="fr-FR" w:eastAsia="fr-FR"/>
+        </w:rPr>
+        <w:t xml:space="preserve">1.      </w:t>
+      </w:r>
+      <w:r>
+        <w:rPr>
+          <w:rFonts w:ascii="Calibri" w:eastAsia="Times New Roman" w:hAnsi="Calibri" w:cs="Calibri"/>
+          <w:b/>
+          <w:bCs/>
+          <w:u w:val="single"/>
+          <w:shd w:val="clear" w:color="auto" w:fill="FFFFFF"/>
+          <w:lang w:val="fr-FR" w:eastAsia="fr-FR"/>
+        </w:rPr>
+        <w:t>Condition suspensive et délais</w:t>
       </w:r>
       <w:r>
         <w:br/>
@@ -1942,7 +4906,27 @@
       </w:r>
       <w:r>
         <w:br/>
-        <w:t>2.      Défaillance de la Condition Suspensive</w:t>
+      </w:r>
+      <w:r>
+        <w:rPr>
+          <w:rFonts w:ascii="Calibri" w:eastAsia="Times New Roman" w:hAnsi="Calibri" w:cs="Calibri"/>
+          <w:b/>
+          <w:bCs/>
+          <w:shd w:val="clear" w:color="auto" w:fill="FFFFFF"/>
+          <w:lang w:val="fr-FR" w:eastAsia="fr-FR"/>
+        </w:rPr>
+        <w:t xml:space="preserve">2.      </w:t>
+      </w:r>
+      <w:r>
+        <w:rPr>
+          <w:rFonts w:ascii="Calibri" w:eastAsia="Times New Roman" w:hAnsi="Calibri" w:cs="Calibri"/>
+          <w:b/>
+          <w:bCs/>
+          <w:u w:val="single"/>
+          <w:shd w:val="clear" w:color="auto" w:fill="FFFFFF"/>
+          <w:lang w:val="fr-FR" w:eastAsia="fr-FR"/>
+        </w:rPr>
+        <w:t>Défaillance de la Condition Suspensive</w:t>
       </w:r>
       <w:r>
         <w:br/>
@@ -1950,7 +4934,319 @@
       </w:r>
       <w:r>
         <w:br/>
-        <w:t>A défaut de réalisation de la Condition Suspensive dans le délai susvisé, les obligations contractées par chacune des Parties seront caduques, et les Parties reprendront leur pleine et entière liberté sans indemnité de part et d’autre, le Preneur ayant parfaitement connaissance de ce que le présent bail s’inscrit dans un contexte de libération desdits locaux laquelle n’est ni garantie et ni prévisible et ne pouvant, à ce titre, engager une quelconque action à l’encontre du Bailleur.</w:t>
+        <w:t xml:space="preserve">A </w:t>
+      </w:r>
+      <w:proofErr w:type="spellStart"/>
+      <w:r>
+        <w:t>défaut</w:t>
+      </w:r>
+      <w:proofErr w:type="spellEnd"/>
+      <w:r>
+        <w:t xml:space="preserve"> de </w:t>
+      </w:r>
+      <w:proofErr w:type="spellStart"/>
+      <w:r>
+        <w:t>réalisation</w:t>
+      </w:r>
+      <w:proofErr w:type="spellEnd"/>
+      <w:r>
+        <w:t xml:space="preserve"> de la Condition Suspensive dans le </w:t>
+      </w:r>
+      <w:proofErr w:type="spellStart"/>
+      <w:r>
+        <w:t>délai</w:t>
+      </w:r>
+      <w:proofErr w:type="spellEnd"/>
+      <w:r>
+        <w:t xml:space="preserve"> </w:t>
+      </w:r>
+      <w:proofErr w:type="spellStart"/>
+      <w:r>
+        <w:t>susvisé</w:t>
+      </w:r>
+      <w:proofErr w:type="spellEnd"/>
+      <w:r>
+        <w:t xml:space="preserve">, les obligations </w:t>
+      </w:r>
+      <w:proofErr w:type="spellStart"/>
+      <w:r>
+        <w:t>contractées</w:t>
+      </w:r>
+      <w:proofErr w:type="spellEnd"/>
+      <w:r>
+        <w:t xml:space="preserve"> par </w:t>
+      </w:r>
+      <w:proofErr w:type="spellStart"/>
+      <w:r>
+        <w:t>chacune</w:t>
+      </w:r>
+      <w:proofErr w:type="spellEnd"/>
+      <w:r>
+        <w:t xml:space="preserve"> des Parties </w:t>
+      </w:r>
+      <w:proofErr w:type="spellStart"/>
+      <w:r>
+        <w:t>seront</w:t>
+      </w:r>
+      <w:proofErr w:type="spellEnd"/>
+      <w:r>
+        <w:t xml:space="preserve"> </w:t>
+      </w:r>
+      <w:proofErr w:type="spellStart"/>
+      <w:r>
+        <w:t>caduques</w:t>
+      </w:r>
+      <w:proofErr w:type="spellEnd"/>
+      <w:r>
+        <w:t xml:space="preserve">, et les Parties </w:t>
+      </w:r>
+      <w:proofErr w:type="spellStart"/>
+      <w:r>
+        <w:t>reprendront</w:t>
+      </w:r>
+      <w:proofErr w:type="spellEnd"/>
+      <w:r>
+        <w:t xml:space="preserve"> </w:t>
+      </w:r>
+      <w:proofErr w:type="spellStart"/>
+      <w:r>
+        <w:t>leur</w:t>
+      </w:r>
+      <w:proofErr w:type="spellEnd"/>
+      <w:r>
+        <w:t xml:space="preserve"> </w:t>
+      </w:r>
+      <w:proofErr w:type="spellStart"/>
+      <w:r>
+        <w:t>pleine</w:t>
+      </w:r>
+      <w:proofErr w:type="spellEnd"/>
+      <w:r>
+        <w:t xml:space="preserve"> et </w:t>
+      </w:r>
+      <w:proofErr w:type="spellStart"/>
+      <w:r>
+        <w:t>entière</w:t>
+      </w:r>
+      <w:proofErr w:type="spellEnd"/>
+      <w:r>
+        <w:t xml:space="preserve"> liberté sans </w:t>
+      </w:r>
+      <w:proofErr w:type="spellStart"/>
+      <w:r>
+        <w:t>indemnité</w:t>
+      </w:r>
+      <w:proofErr w:type="spellEnd"/>
+      <w:r>
+        <w:t xml:space="preserve"> de part et </w:t>
+      </w:r>
+      <w:proofErr w:type="spellStart"/>
+      <w:r>
+        <w:t>d’autre</w:t>
+      </w:r>
+      <w:proofErr w:type="spellEnd"/>
+      <w:r>
+        <w:t xml:space="preserve">, le </w:t>
+      </w:r>
+      <w:proofErr w:type="spellStart"/>
+      <w:r>
+        <w:t>Preneur</w:t>
+      </w:r>
+      <w:proofErr w:type="spellEnd"/>
+      <w:r>
+        <w:t xml:space="preserve"> </w:t>
+      </w:r>
+      <w:proofErr w:type="spellStart"/>
+      <w:r>
+        <w:t>ayant</w:t>
+      </w:r>
+      <w:proofErr w:type="spellEnd"/>
+      <w:r>
+        <w:t xml:space="preserve"> </w:t>
+      </w:r>
+      <w:proofErr w:type="spellStart"/>
+      <w:r>
+        <w:t>parfaitement</w:t>
+      </w:r>
+      <w:proofErr w:type="spellEnd"/>
+      <w:r>
+        <w:t xml:space="preserve"> </w:t>
+      </w:r>
+      <w:proofErr w:type="spellStart"/>
+      <w:r>
+        <w:t>connaissance</w:t>
+      </w:r>
+      <w:proofErr w:type="spellEnd"/>
+      <w:r>
+        <w:t xml:space="preserve"> de </w:t>
+      </w:r>
+      <w:proofErr w:type="spellStart"/>
+      <w:r>
+        <w:t>ce</w:t>
+      </w:r>
+      <w:proofErr w:type="spellEnd"/>
+      <w:r>
+        <w:t xml:space="preserve"> </w:t>
+      </w:r>
+      <w:proofErr w:type="spellStart"/>
+      <w:r>
+        <w:t>que</w:t>
+      </w:r>
+      <w:proofErr w:type="spellEnd"/>
+      <w:r>
+        <w:t xml:space="preserve"> le </w:t>
+      </w:r>
+      <w:proofErr w:type="spellStart"/>
+      <w:r>
+        <w:t>présent</w:t>
+      </w:r>
+      <w:proofErr w:type="spellEnd"/>
+      <w:r>
+        <w:t xml:space="preserve"> bail </w:t>
+      </w:r>
+      <w:proofErr w:type="spellStart"/>
+      <w:r>
+        <w:t>s’inscrit</w:t>
+      </w:r>
+      <w:proofErr w:type="spellEnd"/>
+      <w:r>
+        <w:t xml:space="preserve"> dans un </w:t>
+      </w:r>
+      <w:proofErr w:type="spellStart"/>
+      <w:r>
+        <w:t>contexte</w:t>
+      </w:r>
+      <w:proofErr w:type="spellEnd"/>
+      <w:r>
+        <w:t xml:space="preserve"> de </w:t>
+      </w:r>
+      <w:proofErr w:type="spellStart"/>
+      <w:r>
+        <w:t>libération</w:t>
+      </w:r>
+      <w:proofErr w:type="spellEnd"/>
+      <w:r>
+        <w:t xml:space="preserve"> </w:t>
+      </w:r>
+      <w:proofErr w:type="spellStart"/>
+      <w:r>
+        <w:t>desdits</w:t>
+      </w:r>
+      <w:proofErr w:type="spellEnd"/>
+      <w:r>
+        <w:t xml:space="preserve"> </w:t>
+      </w:r>
+      <w:proofErr w:type="spellStart"/>
+      <w:r>
+        <w:t>locaux</w:t>
+      </w:r>
+      <w:proofErr w:type="spellEnd"/>
+      <w:r>
+        <w:t xml:space="preserve"> </w:t>
+      </w:r>
+      <w:proofErr w:type="spellStart"/>
+      <w:r>
+        <w:t>laquelle</w:t>
+      </w:r>
+      <w:proofErr w:type="spellEnd"/>
+      <w:r>
+        <w:t xml:space="preserve"> </w:t>
+      </w:r>
+      <w:proofErr w:type="spellStart"/>
+      <w:r>
+        <w:t>n’est</w:t>
+      </w:r>
+      <w:proofErr w:type="spellEnd"/>
+      <w:r>
+        <w:t xml:space="preserve"> </w:t>
+      </w:r>
+      <w:proofErr w:type="spellStart"/>
+      <w:r>
+        <w:t>ni</w:t>
+      </w:r>
+      <w:proofErr w:type="spellEnd"/>
+      <w:r>
+        <w:t xml:space="preserve"> </w:t>
+      </w:r>
+      <w:proofErr w:type="spellStart"/>
+      <w:r>
+        <w:t>garantie</w:t>
+      </w:r>
+      <w:proofErr w:type="spellEnd"/>
+      <w:r>
+        <w:t xml:space="preserve"> et </w:t>
+      </w:r>
+      <w:proofErr w:type="spellStart"/>
+      <w:r>
+        <w:t>ni</w:t>
+      </w:r>
+      <w:proofErr w:type="spellEnd"/>
+      <w:r>
+        <w:t xml:space="preserve"> </w:t>
+      </w:r>
+      <w:proofErr w:type="spellStart"/>
+      <w:r>
+        <w:t>prévisible</w:t>
+      </w:r>
+      <w:proofErr w:type="spellEnd"/>
+      <w:r>
+        <w:t xml:space="preserve"> et ne </w:t>
+      </w:r>
+      <w:proofErr w:type="spellStart"/>
+      <w:r>
+        <w:t>pouvant</w:t>
+      </w:r>
+      <w:proofErr w:type="spellEnd"/>
+      <w:r>
+        <w:t xml:space="preserve">, à </w:t>
+      </w:r>
+      <w:proofErr w:type="spellStart"/>
+      <w:r>
+        <w:t>ce</w:t>
+      </w:r>
+      <w:proofErr w:type="spellEnd"/>
+      <w:r>
+        <w:t xml:space="preserve"> </w:t>
+      </w:r>
+      <w:proofErr w:type="spellStart"/>
+      <w:r>
+        <w:t>titre</w:t>
+      </w:r>
+      <w:proofErr w:type="spellEnd"/>
+      <w:r>
+        <w:t xml:space="preserve">, engager </w:t>
+      </w:r>
+      <w:proofErr w:type="spellStart"/>
+      <w:r>
+        <w:t>une</w:t>
+      </w:r>
+      <w:proofErr w:type="spellEnd"/>
+      <w:r>
+        <w:t xml:space="preserve"> </w:t>
+      </w:r>
+      <w:proofErr w:type="spellStart"/>
+      <w:r>
+        <w:t>quelconque</w:t>
+      </w:r>
+      <w:proofErr w:type="spellEnd"/>
+      <w:r>
+        <w:t xml:space="preserve"> action à </w:t>
+      </w:r>
+      <w:proofErr w:type="spellStart"/>
+      <w:r>
+        <w:t>l’encontre</w:t>
+      </w:r>
+      <w:proofErr w:type="spellEnd"/>
+      <w:r>
+        <w:t xml:space="preserve"> du </w:t>
+      </w:r>
+      <w:proofErr w:type="spellStart"/>
+      <w:r>
+        <w:t>Bailleur</w:t>
+      </w:r>
+      <w:proofErr w:type="spellEnd"/>
+      <w:r>
+        <w:t>.</w:t>
       </w:r>
       <w:r>
         <w:br/>
@@ -1994,30 +5290,145 @@
     </w:p>
     <w:p>
       <w:r>
+        <w:rPr>
+          <w:b/>
+          <w:bCs/>
+          <w:u w:val="single"/>
+        </w:rPr>
         <w:lastRenderedPageBreak/>
-        <w:t>ARTICLE PRELIMINAIRE : BAIL SOUS CONDITIONS SUSPENSIVES</w:t>
-      </w:r>
-      <w:r>
-        <w:br/>
-      </w:r>
-      <w:r>
-        <w:br/>
-      </w:r>
-      <w:r>
-        <w:br/>
-        <w:t>1.      Conditions suspensives et délais</w:t>
-      </w:r>
-      <w:r>
-        <w:br/>
-      </w:r>
-      <w:r>
-        <w:br/>
-        <w:t>Le présent Bail est consenti et accepté par le Bailleur et le Preneur sous réserve de la réalisation des conditions suspensives suivantes :</w:t>
-      </w:r>
-      <w:r>
-        <w:br/>
+        <w:t xml:space="preserve">ARTICLE </w:t>
+      </w:r>
+      <w:proofErr w:type="gramStart"/>
+      <w:r>
+        <w:rPr>
+          <w:b/>
+          <w:bCs/>
+          <w:u w:val="single"/>
+        </w:rPr>
+        <w:t>PRELIMINAIRE :</w:t>
+      </w:r>
+      <w:proofErr w:type="gramEnd"/>
+      <w:r>
+        <w:rPr>
+          <w:b/>
+          <w:bCs/>
+          <w:u w:val="single"/>
+        </w:rPr>
+        <w:t xml:space="preserve"> BAIL SOUS CONDITIONS SUSPENSIVES</w:t>
+      </w:r>
+      <w:r>
+        <w:br/>
+      </w:r>
+      <w:r>
+        <w:br/>
+      </w:r>
+      <w:r>
+        <w:br/>
+      </w:r>
+      <w:r>
+        <w:rPr>
+          <w:rFonts w:ascii="Calibri" w:eastAsia="Times New Roman" w:hAnsi="Calibri" w:cs="Calibri"/>
+          <w:b/>
+          <w:bCs/>
+          <w:shd w:val="clear" w:color="auto" w:fill="FFFFFF"/>
+          <w:lang w:val="fr-FR" w:eastAsia="fr-FR"/>
+        </w:rPr>
+        <w:t xml:space="preserve">1.      </w:t>
+      </w:r>
+      <w:r>
+        <w:rPr>
+          <w:rFonts w:ascii="Calibri" w:eastAsia="Times New Roman" w:hAnsi="Calibri" w:cs="Calibri"/>
+          <w:b/>
+          <w:bCs/>
+          <w:u w:val="single"/>
+          <w:shd w:val="clear" w:color="auto" w:fill="FFFFFF"/>
+          <w:lang w:val="fr-FR" w:eastAsia="fr-FR"/>
+        </w:rPr>
+        <w:t>Condition suspensive et délais</w:t>
+      </w:r>
+      <w:r>
+        <w:br/>
+      </w:r>
+      <w:r>
+        <w:br/>
+        <w:t xml:space="preserve">Le </w:t>
+      </w:r>
+      <w:proofErr w:type="spellStart"/>
+      <w:r>
+        <w:t>présent</w:t>
+      </w:r>
+      <w:proofErr w:type="spellEnd"/>
+      <w:r>
+        <w:t xml:space="preserve"> Bail est </w:t>
+      </w:r>
+      <w:proofErr w:type="spellStart"/>
+      <w:r>
+        <w:t>consenti</w:t>
+      </w:r>
+      <w:proofErr w:type="spellEnd"/>
+      <w:r>
+        <w:t xml:space="preserve"> et </w:t>
+      </w:r>
+      <w:proofErr w:type="spellStart"/>
+      <w:r>
+        <w:t>accepté</w:t>
+      </w:r>
+      <w:proofErr w:type="spellEnd"/>
+      <w:r>
+        <w:t xml:space="preserve"> par le </w:t>
+      </w:r>
+      <w:proofErr w:type="spellStart"/>
+      <w:r>
+        <w:t>Bailleur</w:t>
+      </w:r>
+      <w:proofErr w:type="spellEnd"/>
+      <w:r>
+        <w:t xml:space="preserve"> et le </w:t>
+      </w:r>
+      <w:proofErr w:type="spellStart"/>
+      <w:r>
+        <w:t>Preneur</w:t>
+      </w:r>
+      <w:proofErr w:type="spellEnd"/>
+      <w:r>
+        <w:t xml:space="preserve"> sous </w:t>
+      </w:r>
+      <w:proofErr w:type="spellStart"/>
+      <w:r>
+        <w:t>réserve</w:t>
+      </w:r>
+      <w:proofErr w:type="spellEnd"/>
+      <w:r>
+        <w:t xml:space="preserve"> de la </w:t>
+      </w:r>
+      <w:proofErr w:type="spellStart"/>
+      <w:r>
+        <w:t>réalisation</w:t>
+      </w:r>
+      <w:proofErr w:type="spellEnd"/>
+      <w:r>
+        <w:t xml:space="preserve"> des conditions </w:t>
+      </w:r>
+      <w:proofErr w:type="spellStart"/>
+      <w:r>
+        <w:t>suspensives</w:t>
+      </w:r>
+      <w:proofErr w:type="spellEnd"/>
+      <w:r>
         <w:t xml:space="preserve"> </w:t>
       </w:r>
+      <w:proofErr w:type="spellStart"/>
+      <w:r>
+        <w:t>suivantes</w:t>
+      </w:r>
+      <w:proofErr w:type="spellEnd"/>
+      <w:r>
+        <w:t xml:space="preserve"> :</w:t>
+      </w:r>
+      <w:r>
+        <w:br/>
+        <w:t xml:space="preserve"> </w:t>
+      </w:r>
       <w:r>
         <w:br/>
         <w:t>a.</w:t>
@@ -2062,7 +5473,27 @@
       </w:r>
       <w:r>
         <w:br/>
-        <w:t>2.      Défaillance des Conditions Suspensives</w:t>
+      </w:r>
+      <w:r>
+        <w:rPr>
+          <w:rFonts w:ascii="Calibri" w:eastAsia="Times New Roman" w:hAnsi="Calibri" w:cs="Calibri"/>
+          <w:b/>
+          <w:bCs/>
+          <w:shd w:val="clear" w:color="auto" w:fill="FFFFFF"/>
+          <w:lang w:val="fr-FR" w:eastAsia="fr-FR"/>
+        </w:rPr>
+        <w:t xml:space="preserve">2.      </w:t>
+      </w:r>
+      <w:r>
+        <w:rPr>
+          <w:rFonts w:ascii="Calibri" w:eastAsia="Times New Roman" w:hAnsi="Calibri" w:cs="Calibri"/>
+          <w:b/>
+          <w:bCs/>
+          <w:u w:val="single"/>
+          <w:shd w:val="clear" w:color="auto" w:fill="FFFFFF"/>
+          <w:lang w:val="fr-FR" w:eastAsia="fr-FR"/>
+        </w:rPr>
+        <w:t>Défaillance de la Condition Suspensive</w:t>
       </w:r>
       <w:r>
         <w:br/>
@@ -2121,7 +5552,17 @@
     </w:p>
     <w:p>
       <w:r>
-        <w:t>Dans un immeuble sis à ([Adresse Locaux Loués] (ci-après l’« Immeuble »), au rez-de-chaussée, un local commercial (ci-après les « Locaux Loués ») d’une surface d’environ [Surface totale] m² correspondant au(x) lot(s) de copropriété n°[.] et constitué de[.] et dont le plan est annexé au Bail.</w:t>
+        <w:t>Dans un immeuble sis à (</w:t>
+      </w:r>
+      <w:r>
+        <w:rPr>
+          <w:b/>
+          <w:bCs/>
+        </w:rPr>
+        <w:t xml:space="preserve">[Adresse Locaux Loués] </w:t>
+      </w:r>
+      <w:r>
+        <w:t>(ci-après l’« Immeuble »), au rez-de-chaussée, un local commercial (ci-après les « Locaux Loués ») d’une surface d’environ [Surface totale] m² correspondant au(x) lot(s) de copropriété n°[.] et constitué de[.] et dont le plan est annexé au Bail.</w:t>
       </w:r>
     </w:p>
     <w:p>
@@ -2178,7 +5619,37 @@
     </w:p>
     <w:p>
       <w:r>
-        <w:t>Le présent Bail est conclu et accepté pour une durée de neuf (9) années entières et consécutives prenant effet le [Date de prise d'effet] pour se terminer le [Date de Prise d'effet + 9 ans].</w:t>
+        <w:t xml:space="preserve">Le présent Bail est conclu et accepté pour une durée de </w:t>
+      </w:r>
+      <w:r>
+        <w:rPr>
+          <w:b/>
+          <w:bCs/>
+        </w:rPr>
+        <w:t>neuf (9) années entières et consécutives</w:t>
+      </w:r>
+      <w:r>
+        <w:t xml:space="preserve"> prenant effet le </w:t>
+      </w:r>
+      <w:r>
+        <w:rPr>
+          <w:b/>
+          <w:bCs/>
+        </w:rPr>
+        <w:t>[Date de prise d'effet]</w:t>
+      </w:r>
+      <w:r>
+        <w:t xml:space="preserve"> pour se terminer le </w:t>
+      </w:r>
+      <w:r>
+        <w:rPr>
+          <w:b/>
+          <w:bCs/>
+        </w:rPr>
+        <w:t>[Date de Prise d'effet + 9 ans]</w:t>
+      </w:r>
+      <w:r>
+        <w:t>.</w:t>
       </w:r>
       <w:r>
         <w:br/>
@@ -2239,14 +5710,94 @@
     </w:p>
     <w:p>
       <w:r>
-        <w:t xml:space="preserve">2.1. – Le présent Bail est conclu et accepté pour une durée de [Durée du Bail] ([Durée du Bail en lettres]) années entières et consécutives prenant effet le [Date de prise d'effet] pour se terminer le [Date de prise d'effet + Durée du Bail]. La date d’effet du Bail correspondant au jour de la livraison des Locaux au Preneur.  </w:t>
-      </w:r>
-      <w:r>
-        <w:br/>
-      </w:r>
-      <w:r>
-        <w:br/>
-        <w:t>Le Preneur s’engage et accepte irrévocablement le présent Bail pour une durée ferme de [Durée ferme Bail] ([Durée ferme du Bail en lettres]) années pleines, entières et consécutives, commençant le [Date de prise d'effet] pour se terminer le [Date de prise d'effet + Durée ferme Bail] ; cet engagement constituant pour le Bailleur une condition déterminante du présent Bail, sans laquelle il n’aurait pas contracté.</w:t>
+        <w:t xml:space="preserve">2.1. – Le présent Bail est conclu et accepté pour une durée de </w:t>
+      </w:r>
+      <w:r>
+        <w:rPr>
+          <w:b/>
+          <w:bCs/>
+        </w:rPr>
+        <w:t>[Durée du Bail]</w:t>
+      </w:r>
+      <w:r>
+        <w:t xml:space="preserve"> </w:t>
+      </w:r>
+      <w:r>
+        <w:rPr>
+          <w:b/>
+          <w:bCs/>
+        </w:rPr>
+        <w:t>([Durée du Bail en lettres]</w:t>
+      </w:r>
+      <w:r>
+        <w:t xml:space="preserve">) </w:t>
+      </w:r>
+      <w:r>
+        <w:rPr>
+          <w:b/>
+          <w:bCs/>
+        </w:rPr>
+        <w:t>années entières et consécutives</w:t>
+      </w:r>
+      <w:r>
+        <w:t xml:space="preserve"> prenant effet le </w:t>
+      </w:r>
+      <w:r>
+        <w:rPr>
+          <w:b/>
+          <w:bCs/>
+        </w:rPr>
+        <w:t>[Date de prise d'effet]</w:t>
+      </w:r>
+      <w:r>
+        <w:t xml:space="preserve"> pour se terminer le </w:t>
+      </w:r>
+      <w:r>
+        <w:rPr>
+          <w:b/>
+          <w:bCs/>
+        </w:rPr>
+        <w:t>[Date de prise d'effet + Durée du Bail]</w:t>
+      </w:r>
+      <w:r>
+        <w:t xml:space="preserve">. La date d’effet du Bail correspondant au jour de la livraison des Locaux au Preneur.  </w:t>
+      </w:r>
+      <w:r>
+        <w:br/>
+      </w:r>
+      <w:r>
+        <w:br/>
+        <w:t xml:space="preserve">Le Preneur s’engage et accepte irrévocablement le présent Bail pour une </w:t>
+      </w:r>
+      <w:r>
+        <w:rPr>
+          <w:b/>
+          <w:bCs/>
+        </w:rPr>
+        <w:t>durée ferme de [Durée ferme Bail] ([Durée ferme du Bail en lettres]) années pleines, entières et consécutives</w:t>
+      </w:r>
+      <w:r>
+        <w:t xml:space="preserve">, commençant le </w:t>
+      </w:r>
+      <w:r>
+        <w:rPr>
+          <w:b/>
+          <w:bCs/>
+        </w:rPr>
+        <w:t>[Date de prise d'effet]</w:t>
+      </w:r>
+      <w:r>
+        <w:t xml:space="preserve"> pour se terminer le </w:t>
+      </w:r>
+      <w:r>
+        <w:rPr>
+          <w:b/>
+          <w:bCs/>
+        </w:rPr>
+        <w:t xml:space="preserve">[Date de prise d'effet + Durée ferme Bail] </w:t>
+      </w:r>
+      <w:r>
+        <w:t>; cet engagement constituant pour le Bailleur une condition déterminante du présent Bail, sans laquelle il n’aurait pas contracté.</w:t>
       </w:r>
       <w:r>
         <w:br/>

</xml_diff>